<commit_message>
style(lab2): use bordered tables and Nota paragraphs in report
</commit_message>
<xml_diff>
--- a/lab2/informe/Informe_Laboratorio2_FAT32_NTFS.docx
+++ b/lab2/informe/Informe_Laboratorio2_FAT32_NTFS.docx
@@ -678,9 +678,9 @@
             <w:tcW w:type="dxa" w:w="2400"/>
             <w:tcBorders>
               <w:top w:val="single" w:color="000000" w:sz="8"/>
-              <w:left w:val="none" w:color="FFFFFF" w:sz="0"/>
-              <w:bottom w:val="single" w:color="000000" w:sz="8"/>
-              <w:right w:val="none" w:color="FFFFFF" w:sz="0"/>
+              <w:left w:val="single" w:color="000000" w:sz="8"/>
+              <w:bottom w:val="single" w:color="000000" w:sz="8"/>
+              <w:right w:val="single" w:color="000000" w:sz="8"/>
             </w:tcBorders>
             <w:tcMar>
               <w:top w:type="dxa" w:w="40"/>
@@ -713,9 +713,9 @@
             <w:tcW w:type="dxa" w:w="3400"/>
             <w:tcBorders>
               <w:top w:val="single" w:color="000000" w:sz="8"/>
-              <w:left w:val="none" w:color="FFFFFF" w:sz="0"/>
-              <w:bottom w:val="single" w:color="000000" w:sz="8"/>
-              <w:right w:val="none" w:color="FFFFFF" w:sz="0"/>
+              <w:left w:val="single" w:color="000000" w:sz="8"/>
+              <w:bottom w:val="single" w:color="000000" w:sz="8"/>
+              <w:right w:val="single" w:color="000000" w:sz="8"/>
             </w:tcBorders>
             <w:tcMar>
               <w:top w:type="dxa" w:w="40"/>
@@ -748,9 +748,9 @@
             <w:tcW w:type="dxa" w:w="3560"/>
             <w:tcBorders>
               <w:top w:val="single" w:color="000000" w:sz="8"/>
-              <w:left w:val="none" w:color="FFFFFF" w:sz="0"/>
-              <w:bottom w:val="single" w:color="000000" w:sz="8"/>
-              <w:right w:val="none" w:color="FFFFFF" w:sz="0"/>
+              <w:left w:val="single" w:color="000000" w:sz="8"/>
+              <w:bottom w:val="single" w:color="000000" w:sz="8"/>
+              <w:right w:val="single" w:color="000000" w:sz="8"/>
             </w:tcBorders>
             <w:tcMar>
               <w:top w:type="dxa" w:w="40"/>
@@ -787,10 +787,10 @@
           <w:tcPr>
             <w:tcW w:type="dxa" w:w="2400"/>
             <w:tcBorders>
-              <w:top w:val="none" w:color="FFFFFF" w:sz="0"/>
-              <w:left w:val="none" w:color="FFFFFF" w:sz="0"/>
-              <w:bottom w:val="none" w:color="FFFFFF" w:sz="0"/>
-              <w:right w:val="none" w:color="FFFFFF" w:sz="0"/>
+              <w:top w:val="single" w:color="000000" w:sz="8"/>
+              <w:left w:val="single" w:color="000000" w:sz="8"/>
+              <w:bottom w:val="single" w:color="000000" w:sz="8"/>
+              <w:right w:val="single" w:color="000000" w:sz="8"/>
             </w:tcBorders>
             <w:tcMar>
               <w:top w:type="dxa" w:w="40"/>
@@ -820,10 +820,10 @@
           <w:tcPr>
             <w:tcW w:type="dxa" w:w="3400"/>
             <w:tcBorders>
-              <w:top w:val="none" w:color="FFFFFF" w:sz="0"/>
-              <w:left w:val="none" w:color="FFFFFF" w:sz="0"/>
-              <w:bottom w:val="none" w:color="FFFFFF" w:sz="0"/>
-              <w:right w:val="none" w:color="FFFFFF" w:sz="0"/>
+              <w:top w:val="single" w:color="000000" w:sz="8"/>
+              <w:left w:val="single" w:color="000000" w:sz="8"/>
+              <w:bottom w:val="single" w:color="000000" w:sz="8"/>
+              <w:right w:val="single" w:color="000000" w:sz="8"/>
             </w:tcBorders>
             <w:tcMar>
               <w:top w:type="dxa" w:w="40"/>
@@ -853,10 +853,10 @@
           <w:tcPr>
             <w:tcW w:type="dxa" w:w="3560"/>
             <w:tcBorders>
-              <w:top w:val="none" w:color="FFFFFF" w:sz="0"/>
-              <w:left w:val="none" w:color="FFFFFF" w:sz="0"/>
-              <w:bottom w:val="none" w:color="FFFFFF" w:sz="0"/>
-              <w:right w:val="none" w:color="FFFFFF" w:sz="0"/>
+              <w:top w:val="single" w:color="000000" w:sz="8"/>
+              <w:left w:val="single" w:color="000000" w:sz="8"/>
+              <w:bottom w:val="single" w:color="000000" w:sz="8"/>
+              <w:right w:val="single" w:color="000000" w:sz="8"/>
             </w:tcBorders>
             <w:tcMar>
               <w:top w:type="dxa" w:w="40"/>
@@ -891,10 +891,10 @@
           <w:tcPr>
             <w:tcW w:type="dxa" w:w="2400"/>
             <w:tcBorders>
-              <w:top w:val="none" w:color="FFFFFF" w:sz="0"/>
-              <w:left w:val="none" w:color="FFFFFF" w:sz="0"/>
-              <w:bottom w:val="none" w:color="FFFFFF" w:sz="0"/>
-              <w:right w:val="none" w:color="FFFFFF" w:sz="0"/>
+              <w:top w:val="single" w:color="000000" w:sz="8"/>
+              <w:left w:val="single" w:color="000000" w:sz="8"/>
+              <w:bottom w:val="single" w:color="000000" w:sz="8"/>
+              <w:right w:val="single" w:color="000000" w:sz="8"/>
             </w:tcBorders>
             <w:tcMar>
               <w:top w:type="dxa" w:w="40"/>
@@ -924,10 +924,10 @@
           <w:tcPr>
             <w:tcW w:type="dxa" w:w="3400"/>
             <w:tcBorders>
-              <w:top w:val="none" w:color="FFFFFF" w:sz="0"/>
-              <w:left w:val="none" w:color="FFFFFF" w:sz="0"/>
-              <w:bottom w:val="none" w:color="FFFFFF" w:sz="0"/>
-              <w:right w:val="none" w:color="FFFFFF" w:sz="0"/>
+              <w:top w:val="single" w:color="000000" w:sz="8"/>
+              <w:left w:val="single" w:color="000000" w:sz="8"/>
+              <w:bottom w:val="single" w:color="000000" w:sz="8"/>
+              <w:right w:val="single" w:color="000000" w:sz="8"/>
             </w:tcBorders>
             <w:tcMar>
               <w:top w:type="dxa" w:w="40"/>
@@ -957,10 +957,10 @@
           <w:tcPr>
             <w:tcW w:type="dxa" w:w="3560"/>
             <w:tcBorders>
-              <w:top w:val="none" w:color="FFFFFF" w:sz="0"/>
-              <w:left w:val="none" w:color="FFFFFF" w:sz="0"/>
-              <w:bottom w:val="none" w:color="FFFFFF" w:sz="0"/>
-              <w:right w:val="none" w:color="FFFFFF" w:sz="0"/>
+              <w:top w:val="single" w:color="000000" w:sz="8"/>
+              <w:left w:val="single" w:color="000000" w:sz="8"/>
+              <w:bottom w:val="single" w:color="000000" w:sz="8"/>
+              <w:right w:val="single" w:color="000000" w:sz="8"/>
             </w:tcBorders>
             <w:tcMar>
               <w:top w:type="dxa" w:w="40"/>
@@ -995,10 +995,10 @@
           <w:tcPr>
             <w:tcW w:type="dxa" w:w="2400"/>
             <w:tcBorders>
-              <w:top w:val="none" w:color="FFFFFF" w:sz="0"/>
-              <w:left w:val="none" w:color="FFFFFF" w:sz="0"/>
-              <w:bottom w:val="none" w:color="FFFFFF" w:sz="0"/>
-              <w:right w:val="none" w:color="FFFFFF" w:sz="0"/>
+              <w:top w:val="single" w:color="000000" w:sz="8"/>
+              <w:left w:val="single" w:color="000000" w:sz="8"/>
+              <w:bottom w:val="single" w:color="000000" w:sz="8"/>
+              <w:right w:val="single" w:color="000000" w:sz="8"/>
             </w:tcBorders>
             <w:tcMar>
               <w:top w:type="dxa" w:w="40"/>
@@ -1028,10 +1028,10 @@
           <w:tcPr>
             <w:tcW w:type="dxa" w:w="3400"/>
             <w:tcBorders>
-              <w:top w:val="none" w:color="FFFFFF" w:sz="0"/>
-              <w:left w:val="none" w:color="FFFFFF" w:sz="0"/>
-              <w:bottom w:val="none" w:color="FFFFFF" w:sz="0"/>
-              <w:right w:val="none" w:color="FFFFFF" w:sz="0"/>
+              <w:top w:val="single" w:color="000000" w:sz="8"/>
+              <w:left w:val="single" w:color="000000" w:sz="8"/>
+              <w:bottom w:val="single" w:color="000000" w:sz="8"/>
+              <w:right w:val="single" w:color="000000" w:sz="8"/>
             </w:tcBorders>
             <w:tcMar>
               <w:top w:type="dxa" w:w="40"/>
@@ -1061,10 +1061,10 @@
           <w:tcPr>
             <w:tcW w:type="dxa" w:w="3560"/>
             <w:tcBorders>
-              <w:top w:val="none" w:color="FFFFFF" w:sz="0"/>
-              <w:left w:val="none" w:color="FFFFFF" w:sz="0"/>
-              <w:bottom w:val="none" w:color="FFFFFF" w:sz="0"/>
-              <w:right w:val="none" w:color="FFFFFF" w:sz="0"/>
+              <w:top w:val="single" w:color="000000" w:sz="8"/>
+              <w:left w:val="single" w:color="000000" w:sz="8"/>
+              <w:bottom w:val="single" w:color="000000" w:sz="8"/>
+              <w:right w:val="single" w:color="000000" w:sz="8"/>
             </w:tcBorders>
             <w:tcMar>
               <w:top w:type="dxa" w:w="40"/>
@@ -1099,10 +1099,10 @@
           <w:tcPr>
             <w:tcW w:type="dxa" w:w="2400"/>
             <w:tcBorders>
-              <w:top w:val="none" w:color="FFFFFF" w:sz="0"/>
-              <w:left w:val="none" w:color="FFFFFF" w:sz="0"/>
-              <w:bottom w:val="none" w:color="FFFFFF" w:sz="0"/>
-              <w:right w:val="none" w:color="FFFFFF" w:sz="0"/>
+              <w:top w:val="single" w:color="000000" w:sz="8"/>
+              <w:left w:val="single" w:color="000000" w:sz="8"/>
+              <w:bottom w:val="single" w:color="000000" w:sz="8"/>
+              <w:right w:val="single" w:color="000000" w:sz="8"/>
             </w:tcBorders>
             <w:tcMar>
               <w:top w:type="dxa" w:w="40"/>
@@ -1132,10 +1132,10 @@
           <w:tcPr>
             <w:tcW w:type="dxa" w:w="3400"/>
             <w:tcBorders>
-              <w:top w:val="none" w:color="FFFFFF" w:sz="0"/>
-              <w:left w:val="none" w:color="FFFFFF" w:sz="0"/>
-              <w:bottom w:val="none" w:color="FFFFFF" w:sz="0"/>
-              <w:right w:val="none" w:color="FFFFFF" w:sz="0"/>
+              <w:top w:val="single" w:color="000000" w:sz="8"/>
+              <w:left w:val="single" w:color="000000" w:sz="8"/>
+              <w:bottom w:val="single" w:color="000000" w:sz="8"/>
+              <w:right w:val="single" w:color="000000" w:sz="8"/>
             </w:tcBorders>
             <w:tcMar>
               <w:top w:type="dxa" w:w="40"/>
@@ -1165,10 +1165,10 @@
           <w:tcPr>
             <w:tcW w:type="dxa" w:w="3560"/>
             <w:tcBorders>
-              <w:top w:val="none" w:color="FFFFFF" w:sz="0"/>
-              <w:left w:val="none" w:color="FFFFFF" w:sz="0"/>
-              <w:bottom w:val="none" w:color="FFFFFF" w:sz="0"/>
-              <w:right w:val="none" w:color="FFFFFF" w:sz="0"/>
+              <w:top w:val="single" w:color="000000" w:sz="8"/>
+              <w:left w:val="single" w:color="000000" w:sz="8"/>
+              <w:bottom w:val="single" w:color="000000" w:sz="8"/>
+              <w:right w:val="single" w:color="000000" w:sz="8"/>
             </w:tcBorders>
             <w:tcMar>
               <w:top w:type="dxa" w:w="40"/>
@@ -1203,10 +1203,10 @@
           <w:tcPr>
             <w:tcW w:type="dxa" w:w="2400"/>
             <w:tcBorders>
-              <w:top w:val="none" w:color="FFFFFF" w:sz="0"/>
-              <w:left w:val="none" w:color="FFFFFF" w:sz="0"/>
-              <w:bottom w:val="none" w:color="FFFFFF" w:sz="0"/>
-              <w:right w:val="none" w:color="FFFFFF" w:sz="0"/>
+              <w:top w:val="single" w:color="000000" w:sz="8"/>
+              <w:left w:val="single" w:color="000000" w:sz="8"/>
+              <w:bottom w:val="single" w:color="000000" w:sz="8"/>
+              <w:right w:val="single" w:color="000000" w:sz="8"/>
             </w:tcBorders>
             <w:tcMar>
               <w:top w:type="dxa" w:w="40"/>
@@ -1236,10 +1236,10 @@
           <w:tcPr>
             <w:tcW w:type="dxa" w:w="3400"/>
             <w:tcBorders>
-              <w:top w:val="none" w:color="FFFFFF" w:sz="0"/>
-              <w:left w:val="none" w:color="FFFFFF" w:sz="0"/>
-              <w:bottom w:val="none" w:color="FFFFFF" w:sz="0"/>
-              <w:right w:val="none" w:color="FFFFFF" w:sz="0"/>
+              <w:top w:val="single" w:color="000000" w:sz="8"/>
+              <w:left w:val="single" w:color="000000" w:sz="8"/>
+              <w:bottom w:val="single" w:color="000000" w:sz="8"/>
+              <w:right w:val="single" w:color="000000" w:sz="8"/>
             </w:tcBorders>
             <w:tcMar>
               <w:top w:type="dxa" w:w="40"/>
@@ -1269,10 +1269,10 @@
           <w:tcPr>
             <w:tcW w:type="dxa" w:w="3560"/>
             <w:tcBorders>
-              <w:top w:val="none" w:color="FFFFFF" w:sz="0"/>
-              <w:left w:val="none" w:color="FFFFFF" w:sz="0"/>
-              <w:bottom w:val="none" w:color="FFFFFF" w:sz="0"/>
-              <w:right w:val="none" w:color="FFFFFF" w:sz="0"/>
+              <w:top w:val="single" w:color="000000" w:sz="8"/>
+              <w:left w:val="single" w:color="000000" w:sz="8"/>
+              <w:bottom w:val="single" w:color="000000" w:sz="8"/>
+              <w:right w:val="single" w:color="000000" w:sz="8"/>
             </w:tcBorders>
             <w:tcMar>
               <w:top w:type="dxa" w:w="40"/>
@@ -1307,10 +1307,10 @@
           <w:tcPr>
             <w:tcW w:type="dxa" w:w="2400"/>
             <w:tcBorders>
-              <w:top w:val="none" w:color="FFFFFF" w:sz="0"/>
-              <w:left w:val="none" w:color="FFFFFF" w:sz="0"/>
-              <w:bottom w:val="single" w:color="000000" w:sz="8"/>
-              <w:right w:val="none" w:color="FFFFFF" w:sz="0"/>
+              <w:top w:val="single" w:color="000000" w:sz="8"/>
+              <w:left w:val="single" w:color="000000" w:sz="8"/>
+              <w:bottom w:val="single" w:color="000000" w:sz="8"/>
+              <w:right w:val="single" w:color="000000" w:sz="8"/>
             </w:tcBorders>
             <w:tcMar>
               <w:top w:type="dxa" w:w="40"/>
@@ -1340,10 +1340,10 @@
           <w:tcPr>
             <w:tcW w:type="dxa" w:w="3400"/>
             <w:tcBorders>
-              <w:top w:val="none" w:color="FFFFFF" w:sz="0"/>
-              <w:left w:val="none" w:color="FFFFFF" w:sz="0"/>
-              <w:bottom w:val="single" w:color="000000" w:sz="8"/>
-              <w:right w:val="none" w:color="FFFFFF" w:sz="0"/>
+              <w:top w:val="single" w:color="000000" w:sz="8"/>
+              <w:left w:val="single" w:color="000000" w:sz="8"/>
+              <w:bottom w:val="single" w:color="000000" w:sz="8"/>
+              <w:right w:val="single" w:color="000000" w:sz="8"/>
             </w:tcBorders>
             <w:tcMar>
               <w:top w:type="dxa" w:w="40"/>
@@ -1373,10 +1373,10 @@
           <w:tcPr>
             <w:tcW w:type="dxa" w:w="3560"/>
             <w:tcBorders>
-              <w:top w:val="none" w:color="FFFFFF" w:sz="0"/>
-              <w:left w:val="none" w:color="FFFFFF" w:sz="0"/>
-              <w:bottom w:val="single" w:color="000000" w:sz="8"/>
-              <w:right w:val="none" w:color="FFFFFF" w:sz="0"/>
+              <w:top w:val="single" w:color="000000" w:sz="8"/>
+              <w:left w:val="single" w:color="000000" w:sz="8"/>
+              <w:bottom w:val="single" w:color="000000" w:sz="8"/>
+              <w:right w:val="single" w:color="000000" w:sz="8"/>
             </w:tcBorders>
             <w:tcMar>
               <w:top w:type="dxa" w:w="40"/>
@@ -1411,10 +1411,19 @@
     </w:p>
     <w:p>
       <w:pPr>
-        <w:spacing w:after="0" w:line="360"/>
-        <w:ind w:firstLine="720"/>
-        <w:jc w:val="left"/>
-      </w:pPr>
+        <w:keepNext/>
+        <w:spacing w:after="60" w:before="120" w:line="360"/>
+      </w:pPr>
+      <w:r>
+        <w:rPr>
+          <w:rFonts w:ascii="Times New Roman" w:cs="Times New Roman" w:eastAsia="Times New Roman" w:hAnsi="Times New Roman"/>
+          <w:i/>
+          <w:iCs/>
+          <w:sz w:val="24"/>
+          <w:szCs w:val="24"/>
+        </w:rPr>
+        <w:t xml:space="preserve">Nota. </w:t>
+      </w:r>
       <w:r>
         <w:rPr>
           <w:rFonts w:ascii="Times New Roman" w:cs="Times New Roman" w:eastAsia="Times New Roman" w:hAnsi="Times New Roman"/>
@@ -1428,20 +1437,14 @@
       <w:pPr>
         <w:keepNext/>
         <w:keepLines/>
-        <w:pBdr>
-          <w:top w:val="single" w:color="000000" w:sz="6" w:space="4"/>
-          <w:left w:val="single" w:color="000000" w:sz="6" w:space="4"/>
-          <w:bottom w:val="single" w:color="000000" w:sz="6" w:space="4"/>
-          <w:right w:val="single" w:color="000000" w:sz="6" w:space="4"/>
-        </w:pBdr>
-        <w:spacing w:after="0" w:line="252"/>
-        <w:ind w:left="200" w:right="200"/>
-      </w:pPr>
-      <w:r>
-        <w:rPr>
-          <w:rFonts w:ascii="Consolas" w:cs="Consolas" w:eastAsia="Consolas" w:hAnsi="Consolas"/>
-          <w:sz w:val="19"/>
-          <w:szCs w:val="19"/>
+        <w:spacing w:after="0" w:line="300"/>
+        <w:ind w:left="720"/>
+      </w:pPr>
+      <w:r>
+        <w:rPr>
+          <w:rFonts w:ascii="Times New Roman" w:cs="Times New Roman" w:eastAsia="Times New Roman" w:hAnsi="Times New Roman"/>
+          <w:sz w:val="24"/>
+          <w:szCs w:val="24"/>
         </w:rPr>
         <w:t xml:space="preserve">Sector del cluster c = Reservados + NFAT x SPF + (c - 2) x SPC</w:t>
       </w:r>
@@ -1450,50 +1453,33 @@
       <w:pPr>
         <w:keepNext/>
         <w:keepLines/>
-        <w:pBdr>
-          <w:top w:val="single" w:color="000000" w:sz="6" w:space="4"/>
-          <w:left w:val="single" w:color="000000" w:sz="6" w:space="4"/>
-          <w:bottom w:val="single" w:color="000000" w:sz="6" w:space="4"/>
-          <w:right w:val="single" w:color="000000" w:sz="6" w:space="4"/>
-        </w:pBdr>
-        <w:spacing w:after="0" w:line="252"/>
-        <w:ind w:left="200" w:right="200"/>
-      </w:pPr>
-      <w:r>
-        <w:rPr>
-          <w:rFonts w:ascii="Consolas" w:cs="Consolas" w:eastAsia="Consolas" w:hAnsi="Consolas"/>
-          <w:sz w:val="19"/>
-          <w:szCs w:val="19"/>
-        </w:rPr>
-        <w:t xml:space="preserve">Sector de la raíz    = Reservados + NFAT x SPF + (ClusterRaíz - 2) x SPC</w:t>
-      </w:r>
-    </w:p>
-    <w:p>
-      <w:pPr>
-        <w:keepNext/>
+        <w:spacing w:after="0" w:line="300"/>
+        <w:ind w:left="720"/>
+      </w:pPr>
+      <w:r>
+        <w:rPr>
+          <w:rFonts w:ascii="Times New Roman" w:cs="Times New Roman" w:eastAsia="Times New Roman" w:hAnsi="Times New Roman"/>
+          <w:sz w:val="24"/>
+          <w:szCs w:val="24"/>
+        </w:rPr>
+        <w:t xml:space="preserve">Sector de la raíz = Reservados + NFAT x SPF + (ClusterRaíz - 2) x SPC</w:t>
+      </w:r>
+    </w:p>
+    <w:p>
+      <w:pPr>
+        <w:keepNext w:val="false"/>
         <w:keepLines/>
-        <w:pBdr>
-          <w:top w:val="single" w:color="000000" w:sz="6" w:space="4"/>
-          <w:left w:val="single" w:color="000000" w:sz="6" w:space="4"/>
-          <w:bottom w:val="single" w:color="000000" w:sz="6" w:space="4"/>
-          <w:right w:val="single" w:color="000000" w:sz="6" w:space="4"/>
-        </w:pBdr>
-        <w:spacing w:after="0" w:line="252"/>
-        <w:ind w:left="200" w:right="200"/>
-      </w:pPr>
-      <w:r>
-        <w:rPr>
-          <w:rFonts w:ascii="Consolas" w:cs="Consolas" w:eastAsia="Consolas" w:hAnsi="Consolas"/>
-          <w:sz w:val="19"/>
-          <w:szCs w:val="19"/>
-        </w:rPr>
-        <w:t xml:space="preserve">Cluster inicial      = (High &lt;&lt; 16) | Low</w:t>
-      </w:r>
-    </w:p>
-    <w:p>
-      <w:pPr>
-        <w:spacing w:after="160" w:line="240"/>
-      </w:pPr>
+        <w:spacing w:after="160" w:line="300"/>
+        <w:ind w:left="720"/>
+      </w:pPr>
+      <w:r>
+        <w:rPr>
+          <w:rFonts w:ascii="Times New Roman" w:cs="Times New Roman" w:eastAsia="Times New Roman" w:hAnsi="Times New Roman"/>
+          <w:sz w:val="24"/>
+          <w:szCs w:val="24"/>
+        </w:rPr>
+        <w:t xml:space="preserve">Cluster inicial = (High &lt;&lt; 16) | Low</w:t>
+      </w:r>
     </w:p>
     <w:p>
       <w:pPr>
@@ -1636,9 +1622,9 @@
             <w:tcW w:type="dxa" w:w="4200"/>
             <w:tcBorders>
               <w:top w:val="single" w:color="000000" w:sz="8"/>
-              <w:left w:val="none" w:color="FFFFFF" w:sz="0"/>
-              <w:bottom w:val="single" w:color="000000" w:sz="8"/>
-              <w:right w:val="none" w:color="FFFFFF" w:sz="0"/>
+              <w:left w:val="single" w:color="000000" w:sz="8"/>
+              <w:bottom w:val="single" w:color="000000" w:sz="8"/>
+              <w:right w:val="single" w:color="000000" w:sz="8"/>
             </w:tcBorders>
             <w:tcMar>
               <w:top w:type="dxa" w:w="40"/>
@@ -1671,9 +1657,9 @@
             <w:tcW w:type="dxa" w:w="1800"/>
             <w:tcBorders>
               <w:top w:val="single" w:color="000000" w:sz="8"/>
-              <w:left w:val="none" w:color="FFFFFF" w:sz="0"/>
-              <w:bottom w:val="single" w:color="000000" w:sz="8"/>
-              <w:right w:val="none" w:color="FFFFFF" w:sz="0"/>
+              <w:left w:val="single" w:color="000000" w:sz="8"/>
+              <w:bottom w:val="single" w:color="000000" w:sz="8"/>
+              <w:right w:val="single" w:color="000000" w:sz="8"/>
             </w:tcBorders>
             <w:tcMar>
               <w:top w:type="dxa" w:w="40"/>
@@ -1706,9 +1692,9 @@
             <w:tcW w:type="dxa" w:w="3360"/>
             <w:tcBorders>
               <w:top w:val="single" w:color="000000" w:sz="8"/>
-              <w:left w:val="none" w:color="FFFFFF" w:sz="0"/>
-              <w:bottom w:val="single" w:color="000000" w:sz="8"/>
-              <w:right w:val="none" w:color="FFFFFF" w:sz="0"/>
+              <w:left w:val="single" w:color="000000" w:sz="8"/>
+              <w:bottom w:val="single" w:color="000000" w:sz="8"/>
+              <w:right w:val="single" w:color="000000" w:sz="8"/>
             </w:tcBorders>
             <w:tcMar>
               <w:top w:type="dxa" w:w="40"/>
@@ -1745,10 +1731,10 @@
           <w:tcPr>
             <w:tcW w:type="dxa" w:w="4200"/>
             <w:tcBorders>
-              <w:top w:val="none" w:color="FFFFFF" w:sz="0"/>
-              <w:left w:val="none" w:color="FFFFFF" w:sz="0"/>
-              <w:bottom w:val="none" w:color="FFFFFF" w:sz="0"/>
-              <w:right w:val="none" w:color="FFFFFF" w:sz="0"/>
+              <w:top w:val="single" w:color="000000" w:sz="8"/>
+              <w:left w:val="single" w:color="000000" w:sz="8"/>
+              <w:bottom w:val="single" w:color="000000" w:sz="8"/>
+              <w:right w:val="single" w:color="000000" w:sz="8"/>
             </w:tcBorders>
             <w:tcMar>
               <w:top w:type="dxa" w:w="40"/>
@@ -1778,10 +1764,10 @@
           <w:tcPr>
             <w:tcW w:type="dxa" w:w="1800"/>
             <w:tcBorders>
-              <w:top w:val="none" w:color="FFFFFF" w:sz="0"/>
-              <w:left w:val="none" w:color="FFFFFF" w:sz="0"/>
-              <w:bottom w:val="none" w:color="FFFFFF" w:sz="0"/>
-              <w:right w:val="none" w:color="FFFFFF" w:sz="0"/>
+              <w:top w:val="single" w:color="000000" w:sz="8"/>
+              <w:left w:val="single" w:color="000000" w:sz="8"/>
+              <w:bottom w:val="single" w:color="000000" w:sz="8"/>
+              <w:right w:val="single" w:color="000000" w:sz="8"/>
             </w:tcBorders>
             <w:tcMar>
               <w:top w:type="dxa" w:w="40"/>
@@ -1811,10 +1797,10 @@
           <w:tcPr>
             <w:tcW w:type="dxa" w:w="3360"/>
             <w:tcBorders>
-              <w:top w:val="none" w:color="FFFFFF" w:sz="0"/>
-              <w:left w:val="none" w:color="FFFFFF" w:sz="0"/>
-              <w:bottom w:val="none" w:color="FFFFFF" w:sz="0"/>
-              <w:right w:val="none" w:color="FFFFFF" w:sz="0"/>
+              <w:top w:val="single" w:color="000000" w:sz="8"/>
+              <w:left w:val="single" w:color="000000" w:sz="8"/>
+              <w:bottom w:val="single" w:color="000000" w:sz="8"/>
+              <w:right w:val="single" w:color="000000" w:sz="8"/>
             </w:tcBorders>
             <w:tcMar>
               <w:top w:type="dxa" w:w="40"/>
@@ -1849,10 +1835,10 @@
           <w:tcPr>
             <w:tcW w:type="dxa" w:w="4200"/>
             <w:tcBorders>
-              <w:top w:val="none" w:color="FFFFFF" w:sz="0"/>
-              <w:left w:val="none" w:color="FFFFFF" w:sz="0"/>
-              <w:bottom w:val="none" w:color="FFFFFF" w:sz="0"/>
-              <w:right w:val="none" w:color="FFFFFF" w:sz="0"/>
+              <w:top w:val="single" w:color="000000" w:sz="8"/>
+              <w:left w:val="single" w:color="000000" w:sz="8"/>
+              <w:bottom w:val="single" w:color="000000" w:sz="8"/>
+              <w:right w:val="single" w:color="000000" w:sz="8"/>
             </w:tcBorders>
             <w:tcMar>
               <w:top w:type="dxa" w:w="40"/>
@@ -1882,10 +1868,10 @@
           <w:tcPr>
             <w:tcW w:type="dxa" w:w="1800"/>
             <w:tcBorders>
-              <w:top w:val="none" w:color="FFFFFF" w:sz="0"/>
-              <w:left w:val="none" w:color="FFFFFF" w:sz="0"/>
-              <w:bottom w:val="none" w:color="FFFFFF" w:sz="0"/>
-              <w:right w:val="none" w:color="FFFFFF" w:sz="0"/>
+              <w:top w:val="single" w:color="000000" w:sz="8"/>
+              <w:left w:val="single" w:color="000000" w:sz="8"/>
+              <w:bottom w:val="single" w:color="000000" w:sz="8"/>
+              <w:right w:val="single" w:color="000000" w:sz="8"/>
             </w:tcBorders>
             <w:tcMar>
               <w:top w:type="dxa" w:w="40"/>
@@ -1915,10 +1901,10 @@
           <w:tcPr>
             <w:tcW w:type="dxa" w:w="3360"/>
             <w:tcBorders>
-              <w:top w:val="none" w:color="FFFFFF" w:sz="0"/>
-              <w:left w:val="none" w:color="FFFFFF" w:sz="0"/>
-              <w:bottom w:val="none" w:color="FFFFFF" w:sz="0"/>
-              <w:right w:val="none" w:color="FFFFFF" w:sz="0"/>
+              <w:top w:val="single" w:color="000000" w:sz="8"/>
+              <w:left w:val="single" w:color="000000" w:sz="8"/>
+              <w:bottom w:val="single" w:color="000000" w:sz="8"/>
+              <w:right w:val="single" w:color="000000" w:sz="8"/>
             </w:tcBorders>
             <w:tcMar>
               <w:top w:type="dxa" w:w="40"/>
@@ -1953,10 +1939,10 @@
           <w:tcPr>
             <w:tcW w:type="dxa" w:w="4200"/>
             <w:tcBorders>
-              <w:top w:val="none" w:color="FFFFFF" w:sz="0"/>
-              <w:left w:val="none" w:color="FFFFFF" w:sz="0"/>
-              <w:bottom w:val="none" w:color="FFFFFF" w:sz="0"/>
-              <w:right w:val="none" w:color="FFFFFF" w:sz="0"/>
+              <w:top w:val="single" w:color="000000" w:sz="8"/>
+              <w:left w:val="single" w:color="000000" w:sz="8"/>
+              <w:bottom w:val="single" w:color="000000" w:sz="8"/>
+              <w:right w:val="single" w:color="000000" w:sz="8"/>
             </w:tcBorders>
             <w:tcMar>
               <w:top w:type="dxa" w:w="40"/>
@@ -1986,10 +1972,10 @@
           <w:tcPr>
             <w:tcW w:type="dxa" w:w="1800"/>
             <w:tcBorders>
-              <w:top w:val="none" w:color="FFFFFF" w:sz="0"/>
-              <w:left w:val="none" w:color="FFFFFF" w:sz="0"/>
-              <w:bottom w:val="none" w:color="FFFFFF" w:sz="0"/>
-              <w:right w:val="none" w:color="FFFFFF" w:sz="0"/>
+              <w:top w:val="single" w:color="000000" w:sz="8"/>
+              <w:left w:val="single" w:color="000000" w:sz="8"/>
+              <w:bottom w:val="single" w:color="000000" w:sz="8"/>
+              <w:right w:val="single" w:color="000000" w:sz="8"/>
             </w:tcBorders>
             <w:tcMar>
               <w:top w:type="dxa" w:w="40"/>
@@ -2019,10 +2005,10 @@
           <w:tcPr>
             <w:tcW w:type="dxa" w:w="3360"/>
             <w:tcBorders>
-              <w:top w:val="none" w:color="FFFFFF" w:sz="0"/>
-              <w:left w:val="none" w:color="FFFFFF" w:sz="0"/>
-              <w:bottom w:val="none" w:color="FFFFFF" w:sz="0"/>
-              <w:right w:val="none" w:color="FFFFFF" w:sz="0"/>
+              <w:top w:val="single" w:color="000000" w:sz="8"/>
+              <w:left w:val="single" w:color="000000" w:sz="8"/>
+              <w:bottom w:val="single" w:color="000000" w:sz="8"/>
+              <w:right w:val="single" w:color="000000" w:sz="8"/>
             </w:tcBorders>
             <w:tcMar>
               <w:top w:type="dxa" w:w="40"/>
@@ -2057,10 +2043,10 @@
           <w:tcPr>
             <w:tcW w:type="dxa" w:w="4200"/>
             <w:tcBorders>
-              <w:top w:val="none" w:color="FFFFFF" w:sz="0"/>
-              <w:left w:val="none" w:color="FFFFFF" w:sz="0"/>
-              <w:bottom w:val="none" w:color="FFFFFF" w:sz="0"/>
-              <w:right w:val="none" w:color="FFFFFF" w:sz="0"/>
+              <w:top w:val="single" w:color="000000" w:sz="8"/>
+              <w:left w:val="single" w:color="000000" w:sz="8"/>
+              <w:bottom w:val="single" w:color="000000" w:sz="8"/>
+              <w:right w:val="single" w:color="000000" w:sz="8"/>
             </w:tcBorders>
             <w:tcMar>
               <w:top w:type="dxa" w:w="40"/>
@@ -2090,10 +2076,10 @@
           <w:tcPr>
             <w:tcW w:type="dxa" w:w="1800"/>
             <w:tcBorders>
-              <w:top w:val="none" w:color="FFFFFF" w:sz="0"/>
-              <w:left w:val="none" w:color="FFFFFF" w:sz="0"/>
-              <w:bottom w:val="none" w:color="FFFFFF" w:sz="0"/>
-              <w:right w:val="none" w:color="FFFFFF" w:sz="0"/>
+              <w:top w:val="single" w:color="000000" w:sz="8"/>
+              <w:left w:val="single" w:color="000000" w:sz="8"/>
+              <w:bottom w:val="single" w:color="000000" w:sz="8"/>
+              <w:right w:val="single" w:color="000000" w:sz="8"/>
             </w:tcBorders>
             <w:tcMar>
               <w:top w:type="dxa" w:w="40"/>
@@ -2123,10 +2109,10 @@
           <w:tcPr>
             <w:tcW w:type="dxa" w:w="3360"/>
             <w:tcBorders>
-              <w:top w:val="none" w:color="FFFFFF" w:sz="0"/>
-              <w:left w:val="none" w:color="FFFFFF" w:sz="0"/>
-              <w:bottom w:val="none" w:color="FFFFFF" w:sz="0"/>
-              <w:right w:val="none" w:color="FFFFFF" w:sz="0"/>
+              <w:top w:val="single" w:color="000000" w:sz="8"/>
+              <w:left w:val="single" w:color="000000" w:sz="8"/>
+              <w:bottom w:val="single" w:color="000000" w:sz="8"/>
+              <w:right w:val="single" w:color="000000" w:sz="8"/>
             </w:tcBorders>
             <w:tcMar>
               <w:top w:type="dxa" w:w="40"/>
@@ -2161,10 +2147,10 @@
           <w:tcPr>
             <w:tcW w:type="dxa" w:w="4200"/>
             <w:tcBorders>
-              <w:top w:val="none" w:color="FFFFFF" w:sz="0"/>
-              <w:left w:val="none" w:color="FFFFFF" w:sz="0"/>
-              <w:bottom w:val="none" w:color="FFFFFF" w:sz="0"/>
-              <w:right w:val="none" w:color="FFFFFF" w:sz="0"/>
+              <w:top w:val="single" w:color="000000" w:sz="8"/>
+              <w:left w:val="single" w:color="000000" w:sz="8"/>
+              <w:bottom w:val="single" w:color="000000" w:sz="8"/>
+              <w:right w:val="single" w:color="000000" w:sz="8"/>
             </w:tcBorders>
             <w:tcMar>
               <w:top w:type="dxa" w:w="40"/>
@@ -2194,10 +2180,10 @@
           <w:tcPr>
             <w:tcW w:type="dxa" w:w="1800"/>
             <w:tcBorders>
-              <w:top w:val="none" w:color="FFFFFF" w:sz="0"/>
-              <w:left w:val="none" w:color="FFFFFF" w:sz="0"/>
-              <w:bottom w:val="none" w:color="FFFFFF" w:sz="0"/>
-              <w:right w:val="none" w:color="FFFFFF" w:sz="0"/>
+              <w:top w:val="single" w:color="000000" w:sz="8"/>
+              <w:left w:val="single" w:color="000000" w:sz="8"/>
+              <w:bottom w:val="single" w:color="000000" w:sz="8"/>
+              <w:right w:val="single" w:color="000000" w:sz="8"/>
             </w:tcBorders>
             <w:tcMar>
               <w:top w:type="dxa" w:w="40"/>
@@ -2227,10 +2213,10 @@
           <w:tcPr>
             <w:tcW w:type="dxa" w:w="3360"/>
             <w:tcBorders>
-              <w:top w:val="none" w:color="FFFFFF" w:sz="0"/>
-              <w:left w:val="none" w:color="FFFFFF" w:sz="0"/>
-              <w:bottom w:val="none" w:color="FFFFFF" w:sz="0"/>
-              <w:right w:val="none" w:color="FFFFFF" w:sz="0"/>
+              <w:top w:val="single" w:color="000000" w:sz="8"/>
+              <w:left w:val="single" w:color="000000" w:sz="8"/>
+              <w:bottom w:val="single" w:color="000000" w:sz="8"/>
+              <w:right w:val="single" w:color="000000" w:sz="8"/>
             </w:tcBorders>
             <w:tcMar>
               <w:top w:type="dxa" w:w="40"/>
@@ -2265,10 +2251,10 @@
           <w:tcPr>
             <w:tcW w:type="dxa" w:w="4200"/>
             <w:tcBorders>
-              <w:top w:val="none" w:color="FFFFFF" w:sz="0"/>
-              <w:left w:val="none" w:color="FFFFFF" w:sz="0"/>
-              <w:bottom w:val="single" w:color="000000" w:sz="8"/>
-              <w:right w:val="none" w:color="FFFFFF" w:sz="0"/>
+              <w:top w:val="single" w:color="000000" w:sz="8"/>
+              <w:left w:val="single" w:color="000000" w:sz="8"/>
+              <w:bottom w:val="single" w:color="000000" w:sz="8"/>
+              <w:right w:val="single" w:color="000000" w:sz="8"/>
             </w:tcBorders>
             <w:tcMar>
               <w:top w:type="dxa" w:w="40"/>
@@ -2298,10 +2284,10 @@
           <w:tcPr>
             <w:tcW w:type="dxa" w:w="1800"/>
             <w:tcBorders>
-              <w:top w:val="none" w:color="FFFFFF" w:sz="0"/>
-              <w:left w:val="none" w:color="FFFFFF" w:sz="0"/>
-              <w:bottom w:val="single" w:color="000000" w:sz="8"/>
-              <w:right w:val="none" w:color="FFFFFF" w:sz="0"/>
+              <w:top w:val="single" w:color="000000" w:sz="8"/>
+              <w:left w:val="single" w:color="000000" w:sz="8"/>
+              <w:bottom w:val="single" w:color="000000" w:sz="8"/>
+              <w:right w:val="single" w:color="000000" w:sz="8"/>
             </w:tcBorders>
             <w:tcMar>
               <w:top w:type="dxa" w:w="40"/>
@@ -2331,10 +2317,10 @@
           <w:tcPr>
             <w:tcW w:type="dxa" w:w="3360"/>
             <w:tcBorders>
-              <w:top w:val="none" w:color="FFFFFF" w:sz="0"/>
-              <w:left w:val="none" w:color="FFFFFF" w:sz="0"/>
-              <w:bottom w:val="single" w:color="000000" w:sz="8"/>
-              <w:right w:val="none" w:color="FFFFFF" w:sz="0"/>
+              <w:top w:val="single" w:color="000000" w:sz="8"/>
+              <w:left w:val="single" w:color="000000" w:sz="8"/>
+              <w:bottom w:val="single" w:color="000000" w:sz="8"/>
+              <w:right w:val="single" w:color="000000" w:sz="8"/>
             </w:tcBorders>
             <w:tcMar>
               <w:top w:type="dxa" w:w="40"/>
@@ -2990,9 +2976,9 @@
             <w:tcW w:type="dxa" w:w="1500"/>
             <w:tcBorders>
               <w:top w:val="single" w:color="000000" w:sz="8"/>
-              <w:left w:val="none" w:color="FFFFFF" w:sz="0"/>
-              <w:bottom w:val="single" w:color="000000" w:sz="8"/>
-              <w:right w:val="none" w:color="FFFFFF" w:sz="0"/>
+              <w:left w:val="single" w:color="000000" w:sz="8"/>
+              <w:bottom w:val="single" w:color="000000" w:sz="8"/>
+              <w:right w:val="single" w:color="000000" w:sz="8"/>
             </w:tcBorders>
             <w:tcMar>
               <w:top w:type="dxa" w:w="40"/>
@@ -3025,9 +3011,9 @@
             <w:tcW w:type="dxa" w:w="3900"/>
             <w:tcBorders>
               <w:top w:val="single" w:color="000000" w:sz="8"/>
-              <w:left w:val="none" w:color="FFFFFF" w:sz="0"/>
-              <w:bottom w:val="single" w:color="000000" w:sz="8"/>
-              <w:right w:val="none" w:color="FFFFFF" w:sz="0"/>
+              <w:left w:val="single" w:color="000000" w:sz="8"/>
+              <w:bottom w:val="single" w:color="000000" w:sz="8"/>
+              <w:right w:val="single" w:color="000000" w:sz="8"/>
             </w:tcBorders>
             <w:tcMar>
               <w:top w:type="dxa" w:w="40"/>
@@ -3060,9 +3046,9 @@
             <w:tcW w:type="dxa" w:w="1000"/>
             <w:tcBorders>
               <w:top w:val="single" w:color="000000" w:sz="8"/>
-              <w:left w:val="none" w:color="FFFFFF" w:sz="0"/>
-              <w:bottom w:val="single" w:color="000000" w:sz="8"/>
-              <w:right w:val="none" w:color="FFFFFF" w:sz="0"/>
+              <w:left w:val="single" w:color="000000" w:sz="8"/>
+              <w:bottom w:val="single" w:color="000000" w:sz="8"/>
+              <w:right w:val="single" w:color="000000" w:sz="8"/>
             </w:tcBorders>
             <w:tcMar>
               <w:top w:type="dxa" w:w="40"/>
@@ -3095,9 +3081,9 @@
             <w:tcW w:type="dxa" w:w="1000"/>
             <w:tcBorders>
               <w:top w:val="single" w:color="000000" w:sz="8"/>
-              <w:left w:val="none" w:color="FFFFFF" w:sz="0"/>
-              <w:bottom w:val="single" w:color="000000" w:sz="8"/>
-              <w:right w:val="none" w:color="FFFFFF" w:sz="0"/>
+              <w:left w:val="single" w:color="000000" w:sz="8"/>
+              <w:bottom w:val="single" w:color="000000" w:sz="8"/>
+              <w:right w:val="single" w:color="000000" w:sz="8"/>
             </w:tcBorders>
             <w:tcMar>
               <w:top w:type="dxa" w:w="40"/>
@@ -3130,9 +3116,9 @@
             <w:tcW w:type="dxa" w:w="1960"/>
             <w:tcBorders>
               <w:top w:val="single" w:color="000000" w:sz="8"/>
-              <w:left w:val="none" w:color="FFFFFF" w:sz="0"/>
-              <w:bottom w:val="single" w:color="000000" w:sz="8"/>
-              <w:right w:val="none" w:color="FFFFFF" w:sz="0"/>
+              <w:left w:val="single" w:color="000000" w:sz="8"/>
+              <w:bottom w:val="single" w:color="000000" w:sz="8"/>
+              <w:right w:val="single" w:color="000000" w:sz="8"/>
             </w:tcBorders>
             <w:tcMar>
               <w:top w:type="dxa" w:w="40"/>
@@ -3169,10 +3155,10 @@
           <w:tcPr>
             <w:tcW w:type="dxa" w:w="1500"/>
             <w:tcBorders>
-              <w:top w:val="none" w:color="FFFFFF" w:sz="0"/>
-              <w:left w:val="none" w:color="FFFFFF" w:sz="0"/>
-              <w:bottom w:val="none" w:color="FFFFFF" w:sz="0"/>
-              <w:right w:val="none" w:color="FFFFFF" w:sz="0"/>
+              <w:top w:val="single" w:color="000000" w:sz="8"/>
+              <w:left w:val="single" w:color="000000" w:sz="8"/>
+              <w:bottom w:val="single" w:color="000000" w:sz="8"/>
+              <w:right w:val="single" w:color="000000" w:sz="8"/>
             </w:tcBorders>
             <w:tcMar>
               <w:top w:type="dxa" w:w="40"/>
@@ -3202,10 +3188,10 @@
           <w:tcPr>
             <w:tcW w:type="dxa" w:w="3900"/>
             <w:tcBorders>
-              <w:top w:val="none" w:color="FFFFFF" w:sz="0"/>
-              <w:left w:val="none" w:color="FFFFFF" w:sz="0"/>
-              <w:bottom w:val="none" w:color="FFFFFF" w:sz="0"/>
-              <w:right w:val="none" w:color="FFFFFF" w:sz="0"/>
+              <w:top w:val="single" w:color="000000" w:sz="8"/>
+              <w:left w:val="single" w:color="000000" w:sz="8"/>
+              <w:bottom w:val="single" w:color="000000" w:sz="8"/>
+              <w:right w:val="single" w:color="000000" w:sz="8"/>
             </w:tcBorders>
             <w:tcMar>
               <w:top w:type="dxa" w:w="40"/>
@@ -3235,10 +3221,10 @@
           <w:tcPr>
             <w:tcW w:type="dxa" w:w="1000"/>
             <w:tcBorders>
-              <w:top w:val="none" w:color="FFFFFF" w:sz="0"/>
-              <w:left w:val="none" w:color="FFFFFF" w:sz="0"/>
-              <w:bottom w:val="none" w:color="FFFFFF" w:sz="0"/>
-              <w:right w:val="none" w:color="FFFFFF" w:sz="0"/>
+              <w:top w:val="single" w:color="000000" w:sz="8"/>
+              <w:left w:val="single" w:color="000000" w:sz="8"/>
+              <w:bottom w:val="single" w:color="000000" w:sz="8"/>
+              <w:right w:val="single" w:color="000000" w:sz="8"/>
             </w:tcBorders>
             <w:tcMar>
               <w:top w:type="dxa" w:w="40"/>
@@ -3268,10 +3254,10 @@
           <w:tcPr>
             <w:tcW w:type="dxa" w:w="1000"/>
             <w:tcBorders>
-              <w:top w:val="none" w:color="FFFFFF" w:sz="0"/>
-              <w:left w:val="none" w:color="FFFFFF" w:sz="0"/>
-              <w:bottom w:val="none" w:color="FFFFFF" w:sz="0"/>
-              <w:right w:val="none" w:color="FFFFFF" w:sz="0"/>
+              <w:top w:val="single" w:color="000000" w:sz="8"/>
+              <w:left w:val="single" w:color="000000" w:sz="8"/>
+              <w:bottom w:val="single" w:color="000000" w:sz="8"/>
+              <w:right w:val="single" w:color="000000" w:sz="8"/>
             </w:tcBorders>
             <w:tcMar>
               <w:top w:type="dxa" w:w="40"/>
@@ -3301,10 +3287,10 @@
           <w:tcPr>
             <w:tcW w:type="dxa" w:w="1960"/>
             <w:tcBorders>
-              <w:top w:val="none" w:color="FFFFFF" w:sz="0"/>
-              <w:left w:val="none" w:color="FFFFFF" w:sz="0"/>
-              <w:bottom w:val="none" w:color="FFFFFF" w:sz="0"/>
-              <w:right w:val="none" w:color="FFFFFF" w:sz="0"/>
+              <w:top w:val="single" w:color="000000" w:sz="8"/>
+              <w:left w:val="single" w:color="000000" w:sz="8"/>
+              <w:bottom w:val="single" w:color="000000" w:sz="8"/>
+              <w:right w:val="single" w:color="000000" w:sz="8"/>
             </w:tcBorders>
             <w:tcMar>
               <w:top w:type="dxa" w:w="40"/>
@@ -3339,10 +3325,10 @@
           <w:tcPr>
             <w:tcW w:type="dxa" w:w="1500"/>
             <w:tcBorders>
-              <w:top w:val="none" w:color="FFFFFF" w:sz="0"/>
-              <w:left w:val="none" w:color="FFFFFF" w:sz="0"/>
-              <w:bottom w:val="none" w:color="FFFFFF" w:sz="0"/>
-              <w:right w:val="none" w:color="FFFFFF" w:sz="0"/>
+              <w:top w:val="single" w:color="000000" w:sz="8"/>
+              <w:left w:val="single" w:color="000000" w:sz="8"/>
+              <w:bottom w:val="single" w:color="000000" w:sz="8"/>
+              <w:right w:val="single" w:color="000000" w:sz="8"/>
             </w:tcBorders>
             <w:tcMar>
               <w:top w:type="dxa" w:w="40"/>
@@ -3372,10 +3358,10 @@
           <w:tcPr>
             <w:tcW w:type="dxa" w:w="3900"/>
             <w:tcBorders>
-              <w:top w:val="none" w:color="FFFFFF" w:sz="0"/>
-              <w:left w:val="none" w:color="FFFFFF" w:sz="0"/>
-              <w:bottom w:val="none" w:color="FFFFFF" w:sz="0"/>
-              <w:right w:val="none" w:color="FFFFFF" w:sz="0"/>
+              <w:top w:val="single" w:color="000000" w:sz="8"/>
+              <w:left w:val="single" w:color="000000" w:sz="8"/>
+              <w:bottom w:val="single" w:color="000000" w:sz="8"/>
+              <w:right w:val="single" w:color="000000" w:sz="8"/>
             </w:tcBorders>
             <w:tcMar>
               <w:top w:type="dxa" w:w="40"/>
@@ -3405,10 +3391,10 @@
           <w:tcPr>
             <w:tcW w:type="dxa" w:w="1000"/>
             <w:tcBorders>
-              <w:top w:val="none" w:color="FFFFFF" w:sz="0"/>
-              <w:left w:val="none" w:color="FFFFFF" w:sz="0"/>
-              <w:bottom w:val="none" w:color="FFFFFF" w:sz="0"/>
-              <w:right w:val="none" w:color="FFFFFF" w:sz="0"/>
+              <w:top w:val="single" w:color="000000" w:sz="8"/>
+              <w:left w:val="single" w:color="000000" w:sz="8"/>
+              <w:bottom w:val="single" w:color="000000" w:sz="8"/>
+              <w:right w:val="single" w:color="000000" w:sz="8"/>
             </w:tcBorders>
             <w:tcMar>
               <w:top w:type="dxa" w:w="40"/>
@@ -3438,10 +3424,10 @@
           <w:tcPr>
             <w:tcW w:type="dxa" w:w="1000"/>
             <w:tcBorders>
-              <w:top w:val="none" w:color="FFFFFF" w:sz="0"/>
-              <w:left w:val="none" w:color="FFFFFF" w:sz="0"/>
-              <w:bottom w:val="none" w:color="FFFFFF" w:sz="0"/>
-              <w:right w:val="none" w:color="FFFFFF" w:sz="0"/>
+              <w:top w:val="single" w:color="000000" w:sz="8"/>
+              <w:left w:val="single" w:color="000000" w:sz="8"/>
+              <w:bottom w:val="single" w:color="000000" w:sz="8"/>
+              <w:right w:val="single" w:color="000000" w:sz="8"/>
             </w:tcBorders>
             <w:tcMar>
               <w:top w:type="dxa" w:w="40"/>
@@ -3471,10 +3457,10 @@
           <w:tcPr>
             <w:tcW w:type="dxa" w:w="1960"/>
             <w:tcBorders>
-              <w:top w:val="none" w:color="FFFFFF" w:sz="0"/>
-              <w:left w:val="none" w:color="FFFFFF" w:sz="0"/>
-              <w:bottom w:val="none" w:color="FFFFFF" w:sz="0"/>
-              <w:right w:val="none" w:color="FFFFFF" w:sz="0"/>
+              <w:top w:val="single" w:color="000000" w:sz="8"/>
+              <w:left w:val="single" w:color="000000" w:sz="8"/>
+              <w:bottom w:val="single" w:color="000000" w:sz="8"/>
+              <w:right w:val="single" w:color="000000" w:sz="8"/>
             </w:tcBorders>
             <w:tcMar>
               <w:top w:type="dxa" w:w="40"/>
@@ -3509,10 +3495,10 @@
           <w:tcPr>
             <w:tcW w:type="dxa" w:w="1500"/>
             <w:tcBorders>
-              <w:top w:val="none" w:color="FFFFFF" w:sz="0"/>
-              <w:left w:val="none" w:color="FFFFFF" w:sz="0"/>
-              <w:bottom w:val="none" w:color="FFFFFF" w:sz="0"/>
-              <w:right w:val="none" w:color="FFFFFF" w:sz="0"/>
+              <w:top w:val="single" w:color="000000" w:sz="8"/>
+              <w:left w:val="single" w:color="000000" w:sz="8"/>
+              <w:bottom w:val="single" w:color="000000" w:sz="8"/>
+              <w:right w:val="single" w:color="000000" w:sz="8"/>
             </w:tcBorders>
             <w:tcMar>
               <w:top w:type="dxa" w:w="40"/>
@@ -3542,10 +3528,10 @@
           <w:tcPr>
             <w:tcW w:type="dxa" w:w="3900"/>
             <w:tcBorders>
-              <w:top w:val="none" w:color="FFFFFF" w:sz="0"/>
-              <w:left w:val="none" w:color="FFFFFF" w:sz="0"/>
-              <w:bottom w:val="none" w:color="FFFFFF" w:sz="0"/>
-              <w:right w:val="none" w:color="FFFFFF" w:sz="0"/>
+              <w:top w:val="single" w:color="000000" w:sz="8"/>
+              <w:left w:val="single" w:color="000000" w:sz="8"/>
+              <w:bottom w:val="single" w:color="000000" w:sz="8"/>
+              <w:right w:val="single" w:color="000000" w:sz="8"/>
             </w:tcBorders>
             <w:tcMar>
               <w:top w:type="dxa" w:w="40"/>
@@ -3575,10 +3561,10 @@
           <w:tcPr>
             <w:tcW w:type="dxa" w:w="1000"/>
             <w:tcBorders>
-              <w:top w:val="none" w:color="FFFFFF" w:sz="0"/>
-              <w:left w:val="none" w:color="FFFFFF" w:sz="0"/>
-              <w:bottom w:val="none" w:color="FFFFFF" w:sz="0"/>
-              <w:right w:val="none" w:color="FFFFFF" w:sz="0"/>
+              <w:top w:val="single" w:color="000000" w:sz="8"/>
+              <w:left w:val="single" w:color="000000" w:sz="8"/>
+              <w:bottom w:val="single" w:color="000000" w:sz="8"/>
+              <w:right w:val="single" w:color="000000" w:sz="8"/>
             </w:tcBorders>
             <w:tcMar>
               <w:top w:type="dxa" w:w="40"/>
@@ -3608,10 +3594,10 @@
           <w:tcPr>
             <w:tcW w:type="dxa" w:w="1000"/>
             <w:tcBorders>
-              <w:top w:val="none" w:color="FFFFFF" w:sz="0"/>
-              <w:left w:val="none" w:color="FFFFFF" w:sz="0"/>
-              <w:bottom w:val="none" w:color="FFFFFF" w:sz="0"/>
-              <w:right w:val="none" w:color="FFFFFF" w:sz="0"/>
+              <w:top w:val="single" w:color="000000" w:sz="8"/>
+              <w:left w:val="single" w:color="000000" w:sz="8"/>
+              <w:bottom w:val="single" w:color="000000" w:sz="8"/>
+              <w:right w:val="single" w:color="000000" w:sz="8"/>
             </w:tcBorders>
             <w:tcMar>
               <w:top w:type="dxa" w:w="40"/>
@@ -3641,10 +3627,10 @@
           <w:tcPr>
             <w:tcW w:type="dxa" w:w="1960"/>
             <w:tcBorders>
-              <w:top w:val="none" w:color="FFFFFF" w:sz="0"/>
-              <w:left w:val="none" w:color="FFFFFF" w:sz="0"/>
-              <w:bottom w:val="none" w:color="FFFFFF" w:sz="0"/>
-              <w:right w:val="none" w:color="FFFFFF" w:sz="0"/>
+              <w:top w:val="single" w:color="000000" w:sz="8"/>
+              <w:left w:val="single" w:color="000000" w:sz="8"/>
+              <w:bottom w:val="single" w:color="000000" w:sz="8"/>
+              <w:right w:val="single" w:color="000000" w:sz="8"/>
             </w:tcBorders>
             <w:tcMar>
               <w:top w:type="dxa" w:w="40"/>
@@ -3679,10 +3665,10 @@
           <w:tcPr>
             <w:tcW w:type="dxa" w:w="1500"/>
             <w:tcBorders>
-              <w:top w:val="none" w:color="FFFFFF" w:sz="0"/>
-              <w:left w:val="none" w:color="FFFFFF" w:sz="0"/>
-              <w:bottom w:val="none" w:color="FFFFFF" w:sz="0"/>
-              <w:right w:val="none" w:color="FFFFFF" w:sz="0"/>
+              <w:top w:val="single" w:color="000000" w:sz="8"/>
+              <w:left w:val="single" w:color="000000" w:sz="8"/>
+              <w:bottom w:val="single" w:color="000000" w:sz="8"/>
+              <w:right w:val="single" w:color="000000" w:sz="8"/>
             </w:tcBorders>
             <w:tcMar>
               <w:top w:type="dxa" w:w="40"/>
@@ -3712,10 +3698,10 @@
           <w:tcPr>
             <w:tcW w:type="dxa" w:w="3900"/>
             <w:tcBorders>
-              <w:top w:val="none" w:color="FFFFFF" w:sz="0"/>
-              <w:left w:val="none" w:color="FFFFFF" w:sz="0"/>
-              <w:bottom w:val="none" w:color="FFFFFF" w:sz="0"/>
-              <w:right w:val="none" w:color="FFFFFF" w:sz="0"/>
+              <w:top w:val="single" w:color="000000" w:sz="8"/>
+              <w:left w:val="single" w:color="000000" w:sz="8"/>
+              <w:bottom w:val="single" w:color="000000" w:sz="8"/>
+              <w:right w:val="single" w:color="000000" w:sz="8"/>
             </w:tcBorders>
             <w:tcMar>
               <w:top w:type="dxa" w:w="40"/>
@@ -3745,10 +3731,10 @@
           <w:tcPr>
             <w:tcW w:type="dxa" w:w="1000"/>
             <w:tcBorders>
-              <w:top w:val="none" w:color="FFFFFF" w:sz="0"/>
-              <w:left w:val="none" w:color="FFFFFF" w:sz="0"/>
-              <w:bottom w:val="none" w:color="FFFFFF" w:sz="0"/>
-              <w:right w:val="none" w:color="FFFFFF" w:sz="0"/>
+              <w:top w:val="single" w:color="000000" w:sz="8"/>
+              <w:left w:val="single" w:color="000000" w:sz="8"/>
+              <w:bottom w:val="single" w:color="000000" w:sz="8"/>
+              <w:right w:val="single" w:color="000000" w:sz="8"/>
             </w:tcBorders>
             <w:tcMar>
               <w:top w:type="dxa" w:w="40"/>
@@ -3778,10 +3764,10 @@
           <w:tcPr>
             <w:tcW w:type="dxa" w:w="1000"/>
             <w:tcBorders>
-              <w:top w:val="none" w:color="FFFFFF" w:sz="0"/>
-              <w:left w:val="none" w:color="FFFFFF" w:sz="0"/>
-              <w:bottom w:val="none" w:color="FFFFFF" w:sz="0"/>
-              <w:right w:val="none" w:color="FFFFFF" w:sz="0"/>
+              <w:top w:val="single" w:color="000000" w:sz="8"/>
+              <w:left w:val="single" w:color="000000" w:sz="8"/>
+              <w:bottom w:val="single" w:color="000000" w:sz="8"/>
+              <w:right w:val="single" w:color="000000" w:sz="8"/>
             </w:tcBorders>
             <w:tcMar>
               <w:top w:type="dxa" w:w="40"/>
@@ -3811,10 +3797,10 @@
           <w:tcPr>
             <w:tcW w:type="dxa" w:w="1960"/>
             <w:tcBorders>
-              <w:top w:val="none" w:color="FFFFFF" w:sz="0"/>
-              <w:left w:val="none" w:color="FFFFFF" w:sz="0"/>
-              <w:bottom w:val="none" w:color="FFFFFF" w:sz="0"/>
-              <w:right w:val="none" w:color="FFFFFF" w:sz="0"/>
+              <w:top w:val="single" w:color="000000" w:sz="8"/>
+              <w:left w:val="single" w:color="000000" w:sz="8"/>
+              <w:bottom w:val="single" w:color="000000" w:sz="8"/>
+              <w:right w:val="single" w:color="000000" w:sz="8"/>
             </w:tcBorders>
             <w:tcMar>
               <w:top w:type="dxa" w:w="40"/>
@@ -3849,10 +3835,10 @@
           <w:tcPr>
             <w:tcW w:type="dxa" w:w="1500"/>
             <w:tcBorders>
-              <w:top w:val="none" w:color="FFFFFF" w:sz="0"/>
-              <w:left w:val="none" w:color="FFFFFF" w:sz="0"/>
-              <w:bottom w:val="none" w:color="FFFFFF" w:sz="0"/>
-              <w:right w:val="none" w:color="FFFFFF" w:sz="0"/>
+              <w:top w:val="single" w:color="000000" w:sz="8"/>
+              <w:left w:val="single" w:color="000000" w:sz="8"/>
+              <w:bottom w:val="single" w:color="000000" w:sz="8"/>
+              <w:right w:val="single" w:color="000000" w:sz="8"/>
             </w:tcBorders>
             <w:tcMar>
               <w:top w:type="dxa" w:w="40"/>
@@ -3882,10 +3868,10 @@
           <w:tcPr>
             <w:tcW w:type="dxa" w:w="3900"/>
             <w:tcBorders>
-              <w:top w:val="none" w:color="FFFFFF" w:sz="0"/>
-              <w:left w:val="none" w:color="FFFFFF" w:sz="0"/>
-              <w:bottom w:val="none" w:color="FFFFFF" w:sz="0"/>
-              <w:right w:val="none" w:color="FFFFFF" w:sz="0"/>
+              <w:top w:val="single" w:color="000000" w:sz="8"/>
+              <w:left w:val="single" w:color="000000" w:sz="8"/>
+              <w:bottom w:val="single" w:color="000000" w:sz="8"/>
+              <w:right w:val="single" w:color="000000" w:sz="8"/>
             </w:tcBorders>
             <w:tcMar>
               <w:top w:type="dxa" w:w="40"/>
@@ -3915,10 +3901,10 @@
           <w:tcPr>
             <w:tcW w:type="dxa" w:w="1000"/>
             <w:tcBorders>
-              <w:top w:val="none" w:color="FFFFFF" w:sz="0"/>
-              <w:left w:val="none" w:color="FFFFFF" w:sz="0"/>
-              <w:bottom w:val="none" w:color="FFFFFF" w:sz="0"/>
-              <w:right w:val="none" w:color="FFFFFF" w:sz="0"/>
+              <w:top w:val="single" w:color="000000" w:sz="8"/>
+              <w:left w:val="single" w:color="000000" w:sz="8"/>
+              <w:bottom w:val="single" w:color="000000" w:sz="8"/>
+              <w:right w:val="single" w:color="000000" w:sz="8"/>
             </w:tcBorders>
             <w:tcMar>
               <w:top w:type="dxa" w:w="40"/>
@@ -3948,10 +3934,10 @@
           <w:tcPr>
             <w:tcW w:type="dxa" w:w="1000"/>
             <w:tcBorders>
-              <w:top w:val="none" w:color="FFFFFF" w:sz="0"/>
-              <w:left w:val="none" w:color="FFFFFF" w:sz="0"/>
-              <w:bottom w:val="none" w:color="FFFFFF" w:sz="0"/>
-              <w:right w:val="none" w:color="FFFFFF" w:sz="0"/>
+              <w:top w:val="single" w:color="000000" w:sz="8"/>
+              <w:left w:val="single" w:color="000000" w:sz="8"/>
+              <w:bottom w:val="single" w:color="000000" w:sz="8"/>
+              <w:right w:val="single" w:color="000000" w:sz="8"/>
             </w:tcBorders>
             <w:tcMar>
               <w:top w:type="dxa" w:w="40"/>
@@ -3981,10 +3967,10 @@
           <w:tcPr>
             <w:tcW w:type="dxa" w:w="1960"/>
             <w:tcBorders>
-              <w:top w:val="none" w:color="FFFFFF" w:sz="0"/>
-              <w:left w:val="none" w:color="FFFFFF" w:sz="0"/>
-              <w:bottom w:val="none" w:color="FFFFFF" w:sz="0"/>
-              <w:right w:val="none" w:color="FFFFFF" w:sz="0"/>
+              <w:top w:val="single" w:color="000000" w:sz="8"/>
+              <w:left w:val="single" w:color="000000" w:sz="8"/>
+              <w:bottom w:val="single" w:color="000000" w:sz="8"/>
+              <w:right w:val="single" w:color="000000" w:sz="8"/>
             </w:tcBorders>
             <w:tcMar>
               <w:top w:type="dxa" w:w="40"/>
@@ -4019,10 +4005,10 @@
           <w:tcPr>
             <w:tcW w:type="dxa" w:w="1500"/>
             <w:tcBorders>
-              <w:top w:val="none" w:color="FFFFFF" w:sz="0"/>
-              <w:left w:val="none" w:color="FFFFFF" w:sz="0"/>
-              <w:bottom w:val="none" w:color="FFFFFF" w:sz="0"/>
-              <w:right w:val="none" w:color="FFFFFF" w:sz="0"/>
+              <w:top w:val="single" w:color="000000" w:sz="8"/>
+              <w:left w:val="single" w:color="000000" w:sz="8"/>
+              <w:bottom w:val="single" w:color="000000" w:sz="8"/>
+              <w:right w:val="single" w:color="000000" w:sz="8"/>
             </w:tcBorders>
             <w:tcMar>
               <w:top w:type="dxa" w:w="40"/>
@@ -4052,10 +4038,10 @@
           <w:tcPr>
             <w:tcW w:type="dxa" w:w="3900"/>
             <w:tcBorders>
-              <w:top w:val="none" w:color="FFFFFF" w:sz="0"/>
-              <w:left w:val="none" w:color="FFFFFF" w:sz="0"/>
-              <w:bottom w:val="none" w:color="FFFFFF" w:sz="0"/>
-              <w:right w:val="none" w:color="FFFFFF" w:sz="0"/>
+              <w:top w:val="single" w:color="000000" w:sz="8"/>
+              <w:left w:val="single" w:color="000000" w:sz="8"/>
+              <w:bottom w:val="single" w:color="000000" w:sz="8"/>
+              <w:right w:val="single" w:color="000000" w:sz="8"/>
             </w:tcBorders>
             <w:tcMar>
               <w:top w:type="dxa" w:w="40"/>
@@ -4085,10 +4071,10 @@
           <w:tcPr>
             <w:tcW w:type="dxa" w:w="1000"/>
             <w:tcBorders>
-              <w:top w:val="none" w:color="FFFFFF" w:sz="0"/>
-              <w:left w:val="none" w:color="FFFFFF" w:sz="0"/>
-              <w:bottom w:val="none" w:color="FFFFFF" w:sz="0"/>
-              <w:right w:val="none" w:color="FFFFFF" w:sz="0"/>
+              <w:top w:val="single" w:color="000000" w:sz="8"/>
+              <w:left w:val="single" w:color="000000" w:sz="8"/>
+              <w:bottom w:val="single" w:color="000000" w:sz="8"/>
+              <w:right w:val="single" w:color="000000" w:sz="8"/>
             </w:tcBorders>
             <w:tcMar>
               <w:top w:type="dxa" w:w="40"/>
@@ -4118,10 +4104,10 @@
           <w:tcPr>
             <w:tcW w:type="dxa" w:w="1000"/>
             <w:tcBorders>
-              <w:top w:val="none" w:color="FFFFFF" w:sz="0"/>
-              <w:left w:val="none" w:color="FFFFFF" w:sz="0"/>
-              <w:bottom w:val="none" w:color="FFFFFF" w:sz="0"/>
-              <w:right w:val="none" w:color="FFFFFF" w:sz="0"/>
+              <w:top w:val="single" w:color="000000" w:sz="8"/>
+              <w:left w:val="single" w:color="000000" w:sz="8"/>
+              <w:bottom w:val="single" w:color="000000" w:sz="8"/>
+              <w:right w:val="single" w:color="000000" w:sz="8"/>
             </w:tcBorders>
             <w:tcMar>
               <w:top w:type="dxa" w:w="40"/>
@@ -4151,10 +4137,10 @@
           <w:tcPr>
             <w:tcW w:type="dxa" w:w="1960"/>
             <w:tcBorders>
-              <w:top w:val="none" w:color="FFFFFF" w:sz="0"/>
-              <w:left w:val="none" w:color="FFFFFF" w:sz="0"/>
-              <w:bottom w:val="none" w:color="FFFFFF" w:sz="0"/>
-              <w:right w:val="none" w:color="FFFFFF" w:sz="0"/>
+              <w:top w:val="single" w:color="000000" w:sz="8"/>
+              <w:left w:val="single" w:color="000000" w:sz="8"/>
+              <w:bottom w:val="single" w:color="000000" w:sz="8"/>
+              <w:right w:val="single" w:color="000000" w:sz="8"/>
             </w:tcBorders>
             <w:tcMar>
               <w:top w:type="dxa" w:w="40"/>
@@ -4189,10 +4175,10 @@
           <w:tcPr>
             <w:tcW w:type="dxa" w:w="1500"/>
             <w:tcBorders>
-              <w:top w:val="none" w:color="FFFFFF" w:sz="0"/>
-              <w:left w:val="none" w:color="FFFFFF" w:sz="0"/>
-              <w:bottom w:val="none" w:color="FFFFFF" w:sz="0"/>
-              <w:right w:val="none" w:color="FFFFFF" w:sz="0"/>
+              <w:top w:val="single" w:color="000000" w:sz="8"/>
+              <w:left w:val="single" w:color="000000" w:sz="8"/>
+              <w:bottom w:val="single" w:color="000000" w:sz="8"/>
+              <w:right w:val="single" w:color="000000" w:sz="8"/>
             </w:tcBorders>
             <w:tcMar>
               <w:top w:type="dxa" w:w="40"/>
@@ -4222,10 +4208,10 @@
           <w:tcPr>
             <w:tcW w:type="dxa" w:w="3900"/>
             <w:tcBorders>
-              <w:top w:val="none" w:color="FFFFFF" w:sz="0"/>
-              <w:left w:val="none" w:color="FFFFFF" w:sz="0"/>
-              <w:bottom w:val="none" w:color="FFFFFF" w:sz="0"/>
-              <w:right w:val="none" w:color="FFFFFF" w:sz="0"/>
+              <w:top w:val="single" w:color="000000" w:sz="8"/>
+              <w:left w:val="single" w:color="000000" w:sz="8"/>
+              <w:bottom w:val="single" w:color="000000" w:sz="8"/>
+              <w:right w:val="single" w:color="000000" w:sz="8"/>
             </w:tcBorders>
             <w:tcMar>
               <w:top w:type="dxa" w:w="40"/>
@@ -4255,10 +4241,10 @@
           <w:tcPr>
             <w:tcW w:type="dxa" w:w="1000"/>
             <w:tcBorders>
-              <w:top w:val="none" w:color="FFFFFF" w:sz="0"/>
-              <w:left w:val="none" w:color="FFFFFF" w:sz="0"/>
-              <w:bottom w:val="none" w:color="FFFFFF" w:sz="0"/>
-              <w:right w:val="none" w:color="FFFFFF" w:sz="0"/>
+              <w:top w:val="single" w:color="000000" w:sz="8"/>
+              <w:left w:val="single" w:color="000000" w:sz="8"/>
+              <w:bottom w:val="single" w:color="000000" w:sz="8"/>
+              <w:right w:val="single" w:color="000000" w:sz="8"/>
             </w:tcBorders>
             <w:tcMar>
               <w:top w:type="dxa" w:w="40"/>
@@ -4288,10 +4274,10 @@
           <w:tcPr>
             <w:tcW w:type="dxa" w:w="1000"/>
             <w:tcBorders>
-              <w:top w:val="none" w:color="FFFFFF" w:sz="0"/>
-              <w:left w:val="none" w:color="FFFFFF" w:sz="0"/>
-              <w:bottom w:val="none" w:color="FFFFFF" w:sz="0"/>
-              <w:right w:val="none" w:color="FFFFFF" w:sz="0"/>
+              <w:top w:val="single" w:color="000000" w:sz="8"/>
+              <w:left w:val="single" w:color="000000" w:sz="8"/>
+              <w:bottom w:val="single" w:color="000000" w:sz="8"/>
+              <w:right w:val="single" w:color="000000" w:sz="8"/>
             </w:tcBorders>
             <w:tcMar>
               <w:top w:type="dxa" w:w="40"/>
@@ -4321,10 +4307,10 @@
           <w:tcPr>
             <w:tcW w:type="dxa" w:w="1960"/>
             <w:tcBorders>
-              <w:top w:val="none" w:color="FFFFFF" w:sz="0"/>
-              <w:left w:val="none" w:color="FFFFFF" w:sz="0"/>
-              <w:bottom w:val="none" w:color="FFFFFF" w:sz="0"/>
-              <w:right w:val="none" w:color="FFFFFF" w:sz="0"/>
+              <w:top w:val="single" w:color="000000" w:sz="8"/>
+              <w:left w:val="single" w:color="000000" w:sz="8"/>
+              <w:bottom w:val="single" w:color="000000" w:sz="8"/>
+              <w:right w:val="single" w:color="000000" w:sz="8"/>
             </w:tcBorders>
             <w:tcMar>
               <w:top w:type="dxa" w:w="40"/>
@@ -4359,10 +4345,10 @@
           <w:tcPr>
             <w:tcW w:type="dxa" w:w="1500"/>
             <w:tcBorders>
-              <w:top w:val="none" w:color="FFFFFF" w:sz="0"/>
-              <w:left w:val="none" w:color="FFFFFF" w:sz="0"/>
-              <w:bottom w:val="none" w:color="FFFFFF" w:sz="0"/>
-              <w:right w:val="none" w:color="FFFFFF" w:sz="0"/>
+              <w:top w:val="single" w:color="000000" w:sz="8"/>
+              <w:left w:val="single" w:color="000000" w:sz="8"/>
+              <w:bottom w:val="single" w:color="000000" w:sz="8"/>
+              <w:right w:val="single" w:color="000000" w:sz="8"/>
             </w:tcBorders>
             <w:tcMar>
               <w:top w:type="dxa" w:w="40"/>
@@ -4392,10 +4378,10 @@
           <w:tcPr>
             <w:tcW w:type="dxa" w:w="3900"/>
             <w:tcBorders>
-              <w:top w:val="none" w:color="FFFFFF" w:sz="0"/>
-              <w:left w:val="none" w:color="FFFFFF" w:sz="0"/>
-              <w:bottom w:val="none" w:color="FFFFFF" w:sz="0"/>
-              <w:right w:val="none" w:color="FFFFFF" w:sz="0"/>
+              <w:top w:val="single" w:color="000000" w:sz="8"/>
+              <w:left w:val="single" w:color="000000" w:sz="8"/>
+              <w:bottom w:val="single" w:color="000000" w:sz="8"/>
+              <w:right w:val="single" w:color="000000" w:sz="8"/>
             </w:tcBorders>
             <w:tcMar>
               <w:top w:type="dxa" w:w="40"/>
@@ -4425,10 +4411,10 @@
           <w:tcPr>
             <w:tcW w:type="dxa" w:w="1000"/>
             <w:tcBorders>
-              <w:top w:val="none" w:color="FFFFFF" w:sz="0"/>
-              <w:left w:val="none" w:color="FFFFFF" w:sz="0"/>
-              <w:bottom w:val="none" w:color="FFFFFF" w:sz="0"/>
-              <w:right w:val="none" w:color="FFFFFF" w:sz="0"/>
+              <w:top w:val="single" w:color="000000" w:sz="8"/>
+              <w:left w:val="single" w:color="000000" w:sz="8"/>
+              <w:bottom w:val="single" w:color="000000" w:sz="8"/>
+              <w:right w:val="single" w:color="000000" w:sz="8"/>
             </w:tcBorders>
             <w:tcMar>
               <w:top w:type="dxa" w:w="40"/>
@@ -4458,10 +4444,10 @@
           <w:tcPr>
             <w:tcW w:type="dxa" w:w="1000"/>
             <w:tcBorders>
-              <w:top w:val="none" w:color="FFFFFF" w:sz="0"/>
-              <w:left w:val="none" w:color="FFFFFF" w:sz="0"/>
-              <w:bottom w:val="none" w:color="FFFFFF" w:sz="0"/>
-              <w:right w:val="none" w:color="FFFFFF" w:sz="0"/>
+              <w:top w:val="single" w:color="000000" w:sz="8"/>
+              <w:left w:val="single" w:color="000000" w:sz="8"/>
+              <w:bottom w:val="single" w:color="000000" w:sz="8"/>
+              <w:right w:val="single" w:color="000000" w:sz="8"/>
             </w:tcBorders>
             <w:tcMar>
               <w:top w:type="dxa" w:w="40"/>
@@ -4491,10 +4477,10 @@
           <w:tcPr>
             <w:tcW w:type="dxa" w:w="1960"/>
             <w:tcBorders>
-              <w:top w:val="none" w:color="FFFFFF" w:sz="0"/>
-              <w:left w:val="none" w:color="FFFFFF" w:sz="0"/>
-              <w:bottom w:val="none" w:color="FFFFFF" w:sz="0"/>
-              <w:right w:val="none" w:color="FFFFFF" w:sz="0"/>
+              <w:top w:val="single" w:color="000000" w:sz="8"/>
+              <w:left w:val="single" w:color="000000" w:sz="8"/>
+              <w:bottom w:val="single" w:color="000000" w:sz="8"/>
+              <w:right w:val="single" w:color="000000" w:sz="8"/>
             </w:tcBorders>
             <w:tcMar>
               <w:top w:type="dxa" w:w="40"/>
@@ -4529,10 +4515,10 @@
           <w:tcPr>
             <w:tcW w:type="dxa" w:w="1500"/>
             <w:tcBorders>
-              <w:top w:val="none" w:color="FFFFFF" w:sz="0"/>
-              <w:left w:val="none" w:color="FFFFFF" w:sz="0"/>
-              <w:bottom w:val="none" w:color="FFFFFF" w:sz="0"/>
-              <w:right w:val="none" w:color="FFFFFF" w:sz="0"/>
+              <w:top w:val="single" w:color="000000" w:sz="8"/>
+              <w:left w:val="single" w:color="000000" w:sz="8"/>
+              <w:bottom w:val="single" w:color="000000" w:sz="8"/>
+              <w:right w:val="single" w:color="000000" w:sz="8"/>
             </w:tcBorders>
             <w:tcMar>
               <w:top w:type="dxa" w:w="40"/>
@@ -4562,10 +4548,10 @@
           <w:tcPr>
             <w:tcW w:type="dxa" w:w="3900"/>
             <w:tcBorders>
-              <w:top w:val="none" w:color="FFFFFF" w:sz="0"/>
-              <w:left w:val="none" w:color="FFFFFF" w:sz="0"/>
-              <w:bottom w:val="none" w:color="FFFFFF" w:sz="0"/>
-              <w:right w:val="none" w:color="FFFFFF" w:sz="0"/>
+              <w:top w:val="single" w:color="000000" w:sz="8"/>
+              <w:left w:val="single" w:color="000000" w:sz="8"/>
+              <w:bottom w:val="single" w:color="000000" w:sz="8"/>
+              <w:right w:val="single" w:color="000000" w:sz="8"/>
             </w:tcBorders>
             <w:tcMar>
               <w:top w:type="dxa" w:w="40"/>
@@ -4595,10 +4581,10 @@
           <w:tcPr>
             <w:tcW w:type="dxa" w:w="1000"/>
             <w:tcBorders>
-              <w:top w:val="none" w:color="FFFFFF" w:sz="0"/>
-              <w:left w:val="none" w:color="FFFFFF" w:sz="0"/>
-              <w:bottom w:val="none" w:color="FFFFFF" w:sz="0"/>
-              <w:right w:val="none" w:color="FFFFFF" w:sz="0"/>
+              <w:top w:val="single" w:color="000000" w:sz="8"/>
+              <w:left w:val="single" w:color="000000" w:sz="8"/>
+              <w:bottom w:val="single" w:color="000000" w:sz="8"/>
+              <w:right w:val="single" w:color="000000" w:sz="8"/>
             </w:tcBorders>
             <w:tcMar>
               <w:top w:type="dxa" w:w="40"/>
@@ -4628,10 +4614,10 @@
           <w:tcPr>
             <w:tcW w:type="dxa" w:w="1000"/>
             <w:tcBorders>
-              <w:top w:val="none" w:color="FFFFFF" w:sz="0"/>
-              <w:left w:val="none" w:color="FFFFFF" w:sz="0"/>
-              <w:bottom w:val="none" w:color="FFFFFF" w:sz="0"/>
-              <w:right w:val="none" w:color="FFFFFF" w:sz="0"/>
+              <w:top w:val="single" w:color="000000" w:sz="8"/>
+              <w:left w:val="single" w:color="000000" w:sz="8"/>
+              <w:bottom w:val="single" w:color="000000" w:sz="8"/>
+              <w:right w:val="single" w:color="000000" w:sz="8"/>
             </w:tcBorders>
             <w:tcMar>
               <w:top w:type="dxa" w:w="40"/>
@@ -4661,10 +4647,10 @@
           <w:tcPr>
             <w:tcW w:type="dxa" w:w="1960"/>
             <w:tcBorders>
-              <w:top w:val="none" w:color="FFFFFF" w:sz="0"/>
-              <w:left w:val="none" w:color="FFFFFF" w:sz="0"/>
-              <w:bottom w:val="none" w:color="FFFFFF" w:sz="0"/>
-              <w:right w:val="none" w:color="FFFFFF" w:sz="0"/>
+              <w:top w:val="single" w:color="000000" w:sz="8"/>
+              <w:left w:val="single" w:color="000000" w:sz="8"/>
+              <w:bottom w:val="single" w:color="000000" w:sz="8"/>
+              <w:right w:val="single" w:color="000000" w:sz="8"/>
             </w:tcBorders>
             <w:tcMar>
               <w:top w:type="dxa" w:w="40"/>
@@ -4699,10 +4685,10 @@
           <w:tcPr>
             <w:tcW w:type="dxa" w:w="1500"/>
             <w:tcBorders>
-              <w:top w:val="none" w:color="FFFFFF" w:sz="0"/>
-              <w:left w:val="none" w:color="FFFFFF" w:sz="0"/>
-              <w:bottom w:val="none" w:color="FFFFFF" w:sz="0"/>
-              <w:right w:val="none" w:color="FFFFFF" w:sz="0"/>
+              <w:top w:val="single" w:color="000000" w:sz="8"/>
+              <w:left w:val="single" w:color="000000" w:sz="8"/>
+              <w:bottom w:val="single" w:color="000000" w:sz="8"/>
+              <w:right w:val="single" w:color="000000" w:sz="8"/>
             </w:tcBorders>
             <w:tcMar>
               <w:top w:type="dxa" w:w="40"/>
@@ -4732,10 +4718,10 @@
           <w:tcPr>
             <w:tcW w:type="dxa" w:w="3900"/>
             <w:tcBorders>
-              <w:top w:val="none" w:color="FFFFFF" w:sz="0"/>
-              <w:left w:val="none" w:color="FFFFFF" w:sz="0"/>
-              <w:bottom w:val="none" w:color="FFFFFF" w:sz="0"/>
-              <w:right w:val="none" w:color="FFFFFF" w:sz="0"/>
+              <w:top w:val="single" w:color="000000" w:sz="8"/>
+              <w:left w:val="single" w:color="000000" w:sz="8"/>
+              <w:bottom w:val="single" w:color="000000" w:sz="8"/>
+              <w:right w:val="single" w:color="000000" w:sz="8"/>
             </w:tcBorders>
             <w:tcMar>
               <w:top w:type="dxa" w:w="40"/>
@@ -4765,10 +4751,10 @@
           <w:tcPr>
             <w:tcW w:type="dxa" w:w="1000"/>
             <w:tcBorders>
-              <w:top w:val="none" w:color="FFFFFF" w:sz="0"/>
-              <w:left w:val="none" w:color="FFFFFF" w:sz="0"/>
-              <w:bottom w:val="none" w:color="FFFFFF" w:sz="0"/>
-              <w:right w:val="none" w:color="FFFFFF" w:sz="0"/>
+              <w:top w:val="single" w:color="000000" w:sz="8"/>
+              <w:left w:val="single" w:color="000000" w:sz="8"/>
+              <w:bottom w:val="single" w:color="000000" w:sz="8"/>
+              <w:right w:val="single" w:color="000000" w:sz="8"/>
             </w:tcBorders>
             <w:tcMar>
               <w:top w:type="dxa" w:w="40"/>
@@ -4798,10 +4784,10 @@
           <w:tcPr>
             <w:tcW w:type="dxa" w:w="1000"/>
             <w:tcBorders>
-              <w:top w:val="none" w:color="FFFFFF" w:sz="0"/>
-              <w:left w:val="none" w:color="FFFFFF" w:sz="0"/>
-              <w:bottom w:val="none" w:color="FFFFFF" w:sz="0"/>
-              <w:right w:val="none" w:color="FFFFFF" w:sz="0"/>
+              <w:top w:val="single" w:color="000000" w:sz="8"/>
+              <w:left w:val="single" w:color="000000" w:sz="8"/>
+              <w:bottom w:val="single" w:color="000000" w:sz="8"/>
+              <w:right w:val="single" w:color="000000" w:sz="8"/>
             </w:tcBorders>
             <w:tcMar>
               <w:top w:type="dxa" w:w="40"/>
@@ -4831,10 +4817,10 @@
           <w:tcPr>
             <w:tcW w:type="dxa" w:w="1960"/>
             <w:tcBorders>
-              <w:top w:val="none" w:color="FFFFFF" w:sz="0"/>
-              <w:left w:val="none" w:color="FFFFFF" w:sz="0"/>
-              <w:bottom w:val="none" w:color="FFFFFF" w:sz="0"/>
-              <w:right w:val="none" w:color="FFFFFF" w:sz="0"/>
+              <w:top w:val="single" w:color="000000" w:sz="8"/>
+              <w:left w:val="single" w:color="000000" w:sz="8"/>
+              <w:bottom w:val="single" w:color="000000" w:sz="8"/>
+              <w:right w:val="single" w:color="000000" w:sz="8"/>
             </w:tcBorders>
             <w:tcMar>
               <w:top w:type="dxa" w:w="40"/>
@@ -4869,10 +4855,10 @@
           <w:tcPr>
             <w:tcW w:type="dxa" w:w="1500"/>
             <w:tcBorders>
-              <w:top w:val="none" w:color="FFFFFF" w:sz="0"/>
-              <w:left w:val="none" w:color="FFFFFF" w:sz="0"/>
-              <w:bottom w:val="none" w:color="FFFFFF" w:sz="0"/>
-              <w:right w:val="none" w:color="FFFFFF" w:sz="0"/>
+              <w:top w:val="single" w:color="000000" w:sz="8"/>
+              <w:left w:val="single" w:color="000000" w:sz="8"/>
+              <w:bottom w:val="single" w:color="000000" w:sz="8"/>
+              <w:right w:val="single" w:color="000000" w:sz="8"/>
             </w:tcBorders>
             <w:tcMar>
               <w:top w:type="dxa" w:w="40"/>
@@ -4902,10 +4888,10 @@
           <w:tcPr>
             <w:tcW w:type="dxa" w:w="3900"/>
             <w:tcBorders>
-              <w:top w:val="none" w:color="FFFFFF" w:sz="0"/>
-              <w:left w:val="none" w:color="FFFFFF" w:sz="0"/>
-              <w:bottom w:val="none" w:color="FFFFFF" w:sz="0"/>
-              <w:right w:val="none" w:color="FFFFFF" w:sz="0"/>
+              <w:top w:val="single" w:color="000000" w:sz="8"/>
+              <w:left w:val="single" w:color="000000" w:sz="8"/>
+              <w:bottom w:val="single" w:color="000000" w:sz="8"/>
+              <w:right w:val="single" w:color="000000" w:sz="8"/>
             </w:tcBorders>
             <w:tcMar>
               <w:top w:type="dxa" w:w="40"/>
@@ -4935,10 +4921,10 @@
           <w:tcPr>
             <w:tcW w:type="dxa" w:w="1000"/>
             <w:tcBorders>
-              <w:top w:val="none" w:color="FFFFFF" w:sz="0"/>
-              <w:left w:val="none" w:color="FFFFFF" w:sz="0"/>
-              <w:bottom w:val="none" w:color="FFFFFF" w:sz="0"/>
-              <w:right w:val="none" w:color="FFFFFF" w:sz="0"/>
+              <w:top w:val="single" w:color="000000" w:sz="8"/>
+              <w:left w:val="single" w:color="000000" w:sz="8"/>
+              <w:bottom w:val="single" w:color="000000" w:sz="8"/>
+              <w:right w:val="single" w:color="000000" w:sz="8"/>
             </w:tcBorders>
             <w:tcMar>
               <w:top w:type="dxa" w:w="40"/>
@@ -4968,10 +4954,10 @@
           <w:tcPr>
             <w:tcW w:type="dxa" w:w="1000"/>
             <w:tcBorders>
-              <w:top w:val="none" w:color="FFFFFF" w:sz="0"/>
-              <w:left w:val="none" w:color="FFFFFF" w:sz="0"/>
-              <w:bottom w:val="none" w:color="FFFFFF" w:sz="0"/>
-              <w:right w:val="none" w:color="FFFFFF" w:sz="0"/>
+              <w:top w:val="single" w:color="000000" w:sz="8"/>
+              <w:left w:val="single" w:color="000000" w:sz="8"/>
+              <w:bottom w:val="single" w:color="000000" w:sz="8"/>
+              <w:right w:val="single" w:color="000000" w:sz="8"/>
             </w:tcBorders>
             <w:tcMar>
               <w:top w:type="dxa" w:w="40"/>
@@ -5001,10 +4987,10 @@
           <w:tcPr>
             <w:tcW w:type="dxa" w:w="1960"/>
             <w:tcBorders>
-              <w:top w:val="none" w:color="FFFFFF" w:sz="0"/>
-              <w:left w:val="none" w:color="FFFFFF" w:sz="0"/>
-              <w:bottom w:val="none" w:color="FFFFFF" w:sz="0"/>
-              <w:right w:val="none" w:color="FFFFFF" w:sz="0"/>
+              <w:top w:val="single" w:color="000000" w:sz="8"/>
+              <w:left w:val="single" w:color="000000" w:sz="8"/>
+              <w:bottom w:val="single" w:color="000000" w:sz="8"/>
+              <w:right w:val="single" w:color="000000" w:sz="8"/>
             </w:tcBorders>
             <w:tcMar>
               <w:top w:type="dxa" w:w="40"/>
@@ -5039,10 +5025,10 @@
           <w:tcPr>
             <w:tcW w:type="dxa" w:w="1500"/>
             <w:tcBorders>
-              <w:top w:val="none" w:color="FFFFFF" w:sz="0"/>
-              <w:left w:val="none" w:color="FFFFFF" w:sz="0"/>
-              <w:bottom w:val="none" w:color="FFFFFF" w:sz="0"/>
-              <w:right w:val="none" w:color="FFFFFF" w:sz="0"/>
+              <w:top w:val="single" w:color="000000" w:sz="8"/>
+              <w:left w:val="single" w:color="000000" w:sz="8"/>
+              <w:bottom w:val="single" w:color="000000" w:sz="8"/>
+              <w:right w:val="single" w:color="000000" w:sz="8"/>
             </w:tcBorders>
             <w:tcMar>
               <w:top w:type="dxa" w:w="40"/>
@@ -5072,10 +5058,10 @@
           <w:tcPr>
             <w:tcW w:type="dxa" w:w="3900"/>
             <w:tcBorders>
-              <w:top w:val="none" w:color="FFFFFF" w:sz="0"/>
-              <w:left w:val="none" w:color="FFFFFF" w:sz="0"/>
-              <w:bottom w:val="none" w:color="FFFFFF" w:sz="0"/>
-              <w:right w:val="none" w:color="FFFFFF" w:sz="0"/>
+              <w:top w:val="single" w:color="000000" w:sz="8"/>
+              <w:left w:val="single" w:color="000000" w:sz="8"/>
+              <w:bottom w:val="single" w:color="000000" w:sz="8"/>
+              <w:right w:val="single" w:color="000000" w:sz="8"/>
             </w:tcBorders>
             <w:tcMar>
               <w:top w:type="dxa" w:w="40"/>
@@ -5105,10 +5091,10 @@
           <w:tcPr>
             <w:tcW w:type="dxa" w:w="1000"/>
             <w:tcBorders>
-              <w:top w:val="none" w:color="FFFFFF" w:sz="0"/>
-              <w:left w:val="none" w:color="FFFFFF" w:sz="0"/>
-              <w:bottom w:val="none" w:color="FFFFFF" w:sz="0"/>
-              <w:right w:val="none" w:color="FFFFFF" w:sz="0"/>
+              <w:top w:val="single" w:color="000000" w:sz="8"/>
+              <w:left w:val="single" w:color="000000" w:sz="8"/>
+              <w:bottom w:val="single" w:color="000000" w:sz="8"/>
+              <w:right w:val="single" w:color="000000" w:sz="8"/>
             </w:tcBorders>
             <w:tcMar>
               <w:top w:type="dxa" w:w="40"/>
@@ -5138,10 +5124,10 @@
           <w:tcPr>
             <w:tcW w:type="dxa" w:w="1000"/>
             <w:tcBorders>
-              <w:top w:val="none" w:color="FFFFFF" w:sz="0"/>
-              <w:left w:val="none" w:color="FFFFFF" w:sz="0"/>
-              <w:bottom w:val="none" w:color="FFFFFF" w:sz="0"/>
-              <w:right w:val="none" w:color="FFFFFF" w:sz="0"/>
+              <w:top w:val="single" w:color="000000" w:sz="8"/>
+              <w:left w:val="single" w:color="000000" w:sz="8"/>
+              <w:bottom w:val="single" w:color="000000" w:sz="8"/>
+              <w:right w:val="single" w:color="000000" w:sz="8"/>
             </w:tcBorders>
             <w:tcMar>
               <w:top w:type="dxa" w:w="40"/>
@@ -5171,10 +5157,10 @@
           <w:tcPr>
             <w:tcW w:type="dxa" w:w="1960"/>
             <w:tcBorders>
-              <w:top w:val="none" w:color="FFFFFF" w:sz="0"/>
-              <w:left w:val="none" w:color="FFFFFF" w:sz="0"/>
-              <w:bottom w:val="none" w:color="FFFFFF" w:sz="0"/>
-              <w:right w:val="none" w:color="FFFFFF" w:sz="0"/>
+              <w:top w:val="single" w:color="000000" w:sz="8"/>
+              <w:left w:val="single" w:color="000000" w:sz="8"/>
+              <w:bottom w:val="single" w:color="000000" w:sz="8"/>
+              <w:right w:val="single" w:color="000000" w:sz="8"/>
             </w:tcBorders>
             <w:tcMar>
               <w:top w:type="dxa" w:w="40"/>
@@ -5209,10 +5195,10 @@
           <w:tcPr>
             <w:tcW w:type="dxa" w:w="1500"/>
             <w:tcBorders>
-              <w:top w:val="none" w:color="FFFFFF" w:sz="0"/>
-              <w:left w:val="none" w:color="FFFFFF" w:sz="0"/>
-              <w:bottom w:val="single" w:color="000000" w:sz="8"/>
-              <w:right w:val="none" w:color="FFFFFF" w:sz="0"/>
+              <w:top w:val="single" w:color="000000" w:sz="8"/>
+              <w:left w:val="single" w:color="000000" w:sz="8"/>
+              <w:bottom w:val="single" w:color="000000" w:sz="8"/>
+              <w:right w:val="single" w:color="000000" w:sz="8"/>
             </w:tcBorders>
             <w:tcMar>
               <w:top w:type="dxa" w:w="40"/>
@@ -5242,10 +5228,10 @@
           <w:tcPr>
             <w:tcW w:type="dxa" w:w="3900"/>
             <w:tcBorders>
-              <w:top w:val="none" w:color="FFFFFF" w:sz="0"/>
-              <w:left w:val="none" w:color="FFFFFF" w:sz="0"/>
-              <w:bottom w:val="single" w:color="000000" w:sz="8"/>
-              <w:right w:val="none" w:color="FFFFFF" w:sz="0"/>
+              <w:top w:val="single" w:color="000000" w:sz="8"/>
+              <w:left w:val="single" w:color="000000" w:sz="8"/>
+              <w:bottom w:val="single" w:color="000000" w:sz="8"/>
+              <w:right w:val="single" w:color="000000" w:sz="8"/>
             </w:tcBorders>
             <w:tcMar>
               <w:top w:type="dxa" w:w="40"/>
@@ -5275,10 +5261,10 @@
           <w:tcPr>
             <w:tcW w:type="dxa" w:w="1000"/>
             <w:tcBorders>
-              <w:top w:val="none" w:color="FFFFFF" w:sz="0"/>
-              <w:left w:val="none" w:color="FFFFFF" w:sz="0"/>
-              <w:bottom w:val="single" w:color="000000" w:sz="8"/>
-              <w:right w:val="none" w:color="FFFFFF" w:sz="0"/>
+              <w:top w:val="single" w:color="000000" w:sz="8"/>
+              <w:left w:val="single" w:color="000000" w:sz="8"/>
+              <w:bottom w:val="single" w:color="000000" w:sz="8"/>
+              <w:right w:val="single" w:color="000000" w:sz="8"/>
             </w:tcBorders>
             <w:tcMar>
               <w:top w:type="dxa" w:w="40"/>
@@ -5308,10 +5294,10 @@
           <w:tcPr>
             <w:tcW w:type="dxa" w:w="1000"/>
             <w:tcBorders>
-              <w:top w:val="none" w:color="FFFFFF" w:sz="0"/>
-              <w:left w:val="none" w:color="FFFFFF" w:sz="0"/>
-              <w:bottom w:val="single" w:color="000000" w:sz="8"/>
-              <w:right w:val="none" w:color="FFFFFF" w:sz="0"/>
+              <w:top w:val="single" w:color="000000" w:sz="8"/>
+              <w:left w:val="single" w:color="000000" w:sz="8"/>
+              <w:bottom w:val="single" w:color="000000" w:sz="8"/>
+              <w:right w:val="single" w:color="000000" w:sz="8"/>
             </w:tcBorders>
             <w:tcMar>
               <w:top w:type="dxa" w:w="40"/>
@@ -5341,10 +5327,10 @@
           <w:tcPr>
             <w:tcW w:type="dxa" w:w="1960"/>
             <w:tcBorders>
-              <w:top w:val="none" w:color="FFFFFF" w:sz="0"/>
-              <w:left w:val="none" w:color="FFFFFF" w:sz="0"/>
-              <w:bottom w:val="single" w:color="000000" w:sz="8"/>
-              <w:right w:val="none" w:color="FFFFFF" w:sz="0"/>
+              <w:top w:val="single" w:color="000000" w:sz="8"/>
+              <w:left w:val="single" w:color="000000" w:sz="8"/>
+              <w:bottom w:val="single" w:color="000000" w:sz="8"/>
+              <w:right w:val="single" w:color="000000" w:sz="8"/>
             </w:tcBorders>
             <w:tcMar>
               <w:top w:type="dxa" w:w="40"/>
@@ -7042,9 +7028,9 @@
             <w:tcW w:type="dxa" w:w="2000"/>
             <w:tcBorders>
               <w:top w:val="single" w:color="000000" w:sz="8"/>
-              <w:left w:val="none" w:color="FFFFFF" w:sz="0"/>
-              <w:bottom w:val="single" w:color="000000" w:sz="8"/>
-              <w:right w:val="none" w:color="FFFFFF" w:sz="0"/>
+              <w:left w:val="single" w:color="000000" w:sz="8"/>
+              <w:bottom w:val="single" w:color="000000" w:sz="8"/>
+              <w:right w:val="single" w:color="000000" w:sz="8"/>
             </w:tcBorders>
             <w:tcMar>
               <w:top w:type="dxa" w:w="40"/>
@@ -7077,9 +7063,9 @@
             <w:tcW w:type="dxa" w:w="2000"/>
             <w:tcBorders>
               <w:top w:val="single" w:color="000000" w:sz="8"/>
-              <w:left w:val="none" w:color="FFFFFF" w:sz="0"/>
-              <w:bottom w:val="single" w:color="000000" w:sz="8"/>
-              <w:right w:val="none" w:color="FFFFFF" w:sz="0"/>
+              <w:left w:val="single" w:color="000000" w:sz="8"/>
+              <w:bottom w:val="single" w:color="000000" w:sz="8"/>
+              <w:right w:val="single" w:color="000000" w:sz="8"/>
             </w:tcBorders>
             <w:tcMar>
               <w:top w:type="dxa" w:w="40"/>
@@ -7112,9 +7098,9 @@
             <w:tcW w:type="dxa" w:w="5360"/>
             <w:tcBorders>
               <w:top w:val="single" w:color="000000" w:sz="8"/>
-              <w:left w:val="none" w:color="FFFFFF" w:sz="0"/>
-              <w:bottom w:val="single" w:color="000000" w:sz="8"/>
-              <w:right w:val="none" w:color="FFFFFF" w:sz="0"/>
+              <w:left w:val="single" w:color="000000" w:sz="8"/>
+              <w:bottom w:val="single" w:color="000000" w:sz="8"/>
+              <w:right w:val="single" w:color="000000" w:sz="8"/>
             </w:tcBorders>
             <w:tcMar>
               <w:top w:type="dxa" w:w="40"/>
@@ -7151,10 +7137,10 @@
           <w:tcPr>
             <w:tcW w:type="dxa" w:w="2000"/>
             <w:tcBorders>
-              <w:top w:val="none" w:color="FFFFFF" w:sz="0"/>
-              <w:left w:val="none" w:color="FFFFFF" w:sz="0"/>
-              <w:bottom w:val="none" w:color="FFFFFF" w:sz="0"/>
-              <w:right w:val="none" w:color="FFFFFF" w:sz="0"/>
+              <w:top w:val="single" w:color="000000" w:sz="8"/>
+              <w:left w:val="single" w:color="000000" w:sz="8"/>
+              <w:bottom w:val="single" w:color="000000" w:sz="8"/>
+              <w:right w:val="single" w:color="000000" w:sz="8"/>
             </w:tcBorders>
             <w:tcMar>
               <w:top w:type="dxa" w:w="40"/>
@@ -7184,10 +7170,10 @@
           <w:tcPr>
             <w:tcW w:type="dxa" w:w="2000"/>
             <w:tcBorders>
-              <w:top w:val="none" w:color="FFFFFF" w:sz="0"/>
-              <w:left w:val="none" w:color="FFFFFF" w:sz="0"/>
-              <w:bottom w:val="none" w:color="FFFFFF" w:sz="0"/>
-              <w:right w:val="none" w:color="FFFFFF" w:sz="0"/>
+              <w:top w:val="single" w:color="000000" w:sz="8"/>
+              <w:left w:val="single" w:color="000000" w:sz="8"/>
+              <w:bottom w:val="single" w:color="000000" w:sz="8"/>
+              <w:right w:val="single" w:color="000000" w:sz="8"/>
             </w:tcBorders>
             <w:tcMar>
               <w:top w:type="dxa" w:w="40"/>
@@ -7217,10 +7203,10 @@
           <w:tcPr>
             <w:tcW w:type="dxa" w:w="5360"/>
             <w:tcBorders>
-              <w:top w:val="none" w:color="FFFFFF" w:sz="0"/>
-              <w:left w:val="none" w:color="FFFFFF" w:sz="0"/>
-              <w:bottom w:val="none" w:color="FFFFFF" w:sz="0"/>
-              <w:right w:val="none" w:color="FFFFFF" w:sz="0"/>
+              <w:top w:val="single" w:color="000000" w:sz="8"/>
+              <w:left w:val="single" w:color="000000" w:sz="8"/>
+              <w:bottom w:val="single" w:color="000000" w:sz="8"/>
+              <w:right w:val="single" w:color="000000" w:sz="8"/>
             </w:tcBorders>
             <w:tcMar>
               <w:top w:type="dxa" w:w="40"/>
@@ -7255,10 +7241,10 @@
           <w:tcPr>
             <w:tcW w:type="dxa" w:w="2000"/>
             <w:tcBorders>
-              <w:top w:val="none" w:color="FFFFFF" w:sz="0"/>
-              <w:left w:val="none" w:color="FFFFFF" w:sz="0"/>
-              <w:bottom w:val="none" w:color="FFFFFF" w:sz="0"/>
-              <w:right w:val="none" w:color="FFFFFF" w:sz="0"/>
+              <w:top w:val="single" w:color="000000" w:sz="8"/>
+              <w:left w:val="single" w:color="000000" w:sz="8"/>
+              <w:bottom w:val="single" w:color="000000" w:sz="8"/>
+              <w:right w:val="single" w:color="000000" w:sz="8"/>
             </w:tcBorders>
             <w:tcMar>
               <w:top w:type="dxa" w:w="40"/>
@@ -7288,10 +7274,10 @@
           <w:tcPr>
             <w:tcW w:type="dxa" w:w="2000"/>
             <w:tcBorders>
-              <w:top w:val="none" w:color="FFFFFF" w:sz="0"/>
-              <w:left w:val="none" w:color="FFFFFF" w:sz="0"/>
-              <w:bottom w:val="none" w:color="FFFFFF" w:sz="0"/>
-              <w:right w:val="none" w:color="FFFFFF" w:sz="0"/>
+              <w:top w:val="single" w:color="000000" w:sz="8"/>
+              <w:left w:val="single" w:color="000000" w:sz="8"/>
+              <w:bottom w:val="single" w:color="000000" w:sz="8"/>
+              <w:right w:val="single" w:color="000000" w:sz="8"/>
             </w:tcBorders>
             <w:tcMar>
               <w:top w:type="dxa" w:w="40"/>
@@ -7321,10 +7307,10 @@
           <w:tcPr>
             <w:tcW w:type="dxa" w:w="5360"/>
             <w:tcBorders>
-              <w:top w:val="none" w:color="FFFFFF" w:sz="0"/>
-              <w:left w:val="none" w:color="FFFFFF" w:sz="0"/>
-              <w:bottom w:val="none" w:color="FFFFFF" w:sz="0"/>
-              <w:right w:val="none" w:color="FFFFFF" w:sz="0"/>
+              <w:top w:val="single" w:color="000000" w:sz="8"/>
+              <w:left w:val="single" w:color="000000" w:sz="8"/>
+              <w:bottom w:val="single" w:color="000000" w:sz="8"/>
+              <w:right w:val="single" w:color="000000" w:sz="8"/>
             </w:tcBorders>
             <w:tcMar>
               <w:top w:type="dxa" w:w="40"/>
@@ -7359,10 +7345,10 @@
           <w:tcPr>
             <w:tcW w:type="dxa" w:w="2000"/>
             <w:tcBorders>
-              <w:top w:val="none" w:color="FFFFFF" w:sz="0"/>
-              <w:left w:val="none" w:color="FFFFFF" w:sz="0"/>
-              <w:bottom w:val="none" w:color="FFFFFF" w:sz="0"/>
-              <w:right w:val="none" w:color="FFFFFF" w:sz="0"/>
+              <w:top w:val="single" w:color="000000" w:sz="8"/>
+              <w:left w:val="single" w:color="000000" w:sz="8"/>
+              <w:bottom w:val="single" w:color="000000" w:sz="8"/>
+              <w:right w:val="single" w:color="000000" w:sz="8"/>
             </w:tcBorders>
             <w:tcMar>
               <w:top w:type="dxa" w:w="40"/>
@@ -7392,10 +7378,10 @@
           <w:tcPr>
             <w:tcW w:type="dxa" w:w="2000"/>
             <w:tcBorders>
-              <w:top w:val="none" w:color="FFFFFF" w:sz="0"/>
-              <w:left w:val="none" w:color="FFFFFF" w:sz="0"/>
-              <w:bottom w:val="none" w:color="FFFFFF" w:sz="0"/>
-              <w:right w:val="none" w:color="FFFFFF" w:sz="0"/>
+              <w:top w:val="single" w:color="000000" w:sz="8"/>
+              <w:left w:val="single" w:color="000000" w:sz="8"/>
+              <w:bottom w:val="single" w:color="000000" w:sz="8"/>
+              <w:right w:val="single" w:color="000000" w:sz="8"/>
             </w:tcBorders>
             <w:tcMar>
               <w:top w:type="dxa" w:w="40"/>
@@ -7425,10 +7411,10 @@
           <w:tcPr>
             <w:tcW w:type="dxa" w:w="5360"/>
             <w:tcBorders>
-              <w:top w:val="none" w:color="FFFFFF" w:sz="0"/>
-              <w:left w:val="none" w:color="FFFFFF" w:sz="0"/>
-              <w:bottom w:val="none" w:color="FFFFFF" w:sz="0"/>
-              <w:right w:val="none" w:color="FFFFFF" w:sz="0"/>
+              <w:top w:val="single" w:color="000000" w:sz="8"/>
+              <w:left w:val="single" w:color="000000" w:sz="8"/>
+              <w:bottom w:val="single" w:color="000000" w:sz="8"/>
+              <w:right w:val="single" w:color="000000" w:sz="8"/>
             </w:tcBorders>
             <w:tcMar>
               <w:top w:type="dxa" w:w="40"/>
@@ -7463,10 +7449,10 @@
           <w:tcPr>
             <w:tcW w:type="dxa" w:w="2000"/>
             <w:tcBorders>
-              <w:top w:val="none" w:color="FFFFFF" w:sz="0"/>
-              <w:left w:val="none" w:color="FFFFFF" w:sz="0"/>
-              <w:bottom w:val="single" w:color="000000" w:sz="8"/>
-              <w:right w:val="none" w:color="FFFFFF" w:sz="0"/>
+              <w:top w:val="single" w:color="000000" w:sz="8"/>
+              <w:left w:val="single" w:color="000000" w:sz="8"/>
+              <w:bottom w:val="single" w:color="000000" w:sz="8"/>
+              <w:right w:val="single" w:color="000000" w:sz="8"/>
             </w:tcBorders>
             <w:tcMar>
               <w:top w:type="dxa" w:w="40"/>
@@ -7496,10 +7482,10 @@
           <w:tcPr>
             <w:tcW w:type="dxa" w:w="2000"/>
             <w:tcBorders>
-              <w:top w:val="none" w:color="FFFFFF" w:sz="0"/>
-              <w:left w:val="none" w:color="FFFFFF" w:sz="0"/>
-              <w:bottom w:val="single" w:color="000000" w:sz="8"/>
-              <w:right w:val="none" w:color="FFFFFF" w:sz="0"/>
+              <w:top w:val="single" w:color="000000" w:sz="8"/>
+              <w:left w:val="single" w:color="000000" w:sz="8"/>
+              <w:bottom w:val="single" w:color="000000" w:sz="8"/>
+              <w:right w:val="single" w:color="000000" w:sz="8"/>
             </w:tcBorders>
             <w:tcMar>
               <w:top w:type="dxa" w:w="40"/>
@@ -7529,10 +7515,10 @@
           <w:tcPr>
             <w:tcW w:type="dxa" w:w="5360"/>
             <w:tcBorders>
-              <w:top w:val="none" w:color="FFFFFF" w:sz="0"/>
-              <w:left w:val="none" w:color="FFFFFF" w:sz="0"/>
-              <w:bottom w:val="single" w:color="000000" w:sz="8"/>
-              <w:right w:val="none" w:color="FFFFFF" w:sz="0"/>
+              <w:top w:val="single" w:color="000000" w:sz="8"/>
+              <w:left w:val="single" w:color="000000" w:sz="8"/>
+              <w:bottom w:val="single" w:color="000000" w:sz="8"/>
+              <w:right w:val="single" w:color="000000" w:sz="8"/>
             </w:tcBorders>
             <w:tcMar>
               <w:top w:type="dxa" w:w="40"/>
@@ -8221,9 +8207,9 @@
             <w:tcW w:type="dxa" w:w="4000"/>
             <w:tcBorders>
               <w:top w:val="single" w:color="000000" w:sz="8"/>
-              <w:left w:val="none" w:color="FFFFFF" w:sz="0"/>
-              <w:bottom w:val="single" w:color="000000" w:sz="8"/>
-              <w:right w:val="none" w:color="FFFFFF" w:sz="0"/>
+              <w:left w:val="single" w:color="000000" w:sz="8"/>
+              <w:bottom w:val="single" w:color="000000" w:sz="8"/>
+              <w:right w:val="single" w:color="000000" w:sz="8"/>
             </w:tcBorders>
             <w:tcMar>
               <w:top w:type="dxa" w:w="40"/>
@@ -8256,9 +8242,9 @@
             <w:tcW w:type="dxa" w:w="2200"/>
             <w:tcBorders>
               <w:top w:val="single" w:color="000000" w:sz="8"/>
-              <w:left w:val="none" w:color="FFFFFF" w:sz="0"/>
-              <w:bottom w:val="single" w:color="000000" w:sz="8"/>
-              <w:right w:val="none" w:color="FFFFFF" w:sz="0"/>
+              <w:left w:val="single" w:color="000000" w:sz="8"/>
+              <w:bottom w:val="single" w:color="000000" w:sz="8"/>
+              <w:right w:val="single" w:color="000000" w:sz="8"/>
             </w:tcBorders>
             <w:tcMar>
               <w:top w:type="dxa" w:w="40"/>
@@ -8291,9 +8277,9 @@
             <w:tcW w:type="dxa" w:w="3160"/>
             <w:tcBorders>
               <w:top w:val="single" w:color="000000" w:sz="8"/>
-              <w:left w:val="none" w:color="FFFFFF" w:sz="0"/>
-              <w:bottom w:val="single" w:color="000000" w:sz="8"/>
-              <w:right w:val="none" w:color="FFFFFF" w:sz="0"/>
+              <w:left w:val="single" w:color="000000" w:sz="8"/>
+              <w:bottom w:val="single" w:color="000000" w:sz="8"/>
+              <w:right w:val="single" w:color="000000" w:sz="8"/>
             </w:tcBorders>
             <w:tcMar>
               <w:top w:type="dxa" w:w="40"/>
@@ -8330,10 +8316,10 @@
           <w:tcPr>
             <w:tcW w:type="dxa" w:w="4000"/>
             <w:tcBorders>
-              <w:top w:val="none" w:color="FFFFFF" w:sz="0"/>
-              <w:left w:val="none" w:color="FFFFFF" w:sz="0"/>
-              <w:bottom w:val="none" w:color="FFFFFF" w:sz="0"/>
-              <w:right w:val="none" w:color="FFFFFF" w:sz="0"/>
+              <w:top w:val="single" w:color="000000" w:sz="8"/>
+              <w:left w:val="single" w:color="000000" w:sz="8"/>
+              <w:bottom w:val="single" w:color="000000" w:sz="8"/>
+              <w:right w:val="single" w:color="000000" w:sz="8"/>
             </w:tcBorders>
             <w:tcMar>
               <w:top w:type="dxa" w:w="40"/>
@@ -8363,10 +8349,10 @@
           <w:tcPr>
             <w:tcW w:type="dxa" w:w="2200"/>
             <w:tcBorders>
-              <w:top w:val="none" w:color="FFFFFF" w:sz="0"/>
-              <w:left w:val="none" w:color="FFFFFF" w:sz="0"/>
-              <w:bottom w:val="none" w:color="FFFFFF" w:sz="0"/>
-              <w:right w:val="none" w:color="FFFFFF" w:sz="0"/>
+              <w:top w:val="single" w:color="000000" w:sz="8"/>
+              <w:left w:val="single" w:color="000000" w:sz="8"/>
+              <w:bottom w:val="single" w:color="000000" w:sz="8"/>
+              <w:right w:val="single" w:color="000000" w:sz="8"/>
             </w:tcBorders>
             <w:tcMar>
               <w:top w:type="dxa" w:w="40"/>
@@ -8396,10 +8382,10 @@
           <w:tcPr>
             <w:tcW w:type="dxa" w:w="3160"/>
             <w:tcBorders>
-              <w:top w:val="none" w:color="FFFFFF" w:sz="0"/>
-              <w:left w:val="none" w:color="FFFFFF" w:sz="0"/>
-              <w:bottom w:val="none" w:color="FFFFFF" w:sz="0"/>
-              <w:right w:val="none" w:color="FFFFFF" w:sz="0"/>
+              <w:top w:val="single" w:color="000000" w:sz="8"/>
+              <w:left w:val="single" w:color="000000" w:sz="8"/>
+              <w:bottom w:val="single" w:color="000000" w:sz="8"/>
+              <w:right w:val="single" w:color="000000" w:sz="8"/>
             </w:tcBorders>
             <w:tcMar>
               <w:top w:type="dxa" w:w="40"/>
@@ -8434,10 +8420,10 @@
           <w:tcPr>
             <w:tcW w:type="dxa" w:w="4000"/>
             <w:tcBorders>
-              <w:top w:val="none" w:color="FFFFFF" w:sz="0"/>
-              <w:left w:val="none" w:color="FFFFFF" w:sz="0"/>
-              <w:bottom w:val="none" w:color="FFFFFF" w:sz="0"/>
-              <w:right w:val="none" w:color="FFFFFF" w:sz="0"/>
+              <w:top w:val="single" w:color="000000" w:sz="8"/>
+              <w:left w:val="single" w:color="000000" w:sz="8"/>
+              <w:bottom w:val="single" w:color="000000" w:sz="8"/>
+              <w:right w:val="single" w:color="000000" w:sz="8"/>
             </w:tcBorders>
             <w:tcMar>
               <w:top w:type="dxa" w:w="40"/>
@@ -8467,10 +8453,10 @@
           <w:tcPr>
             <w:tcW w:type="dxa" w:w="2200"/>
             <w:tcBorders>
-              <w:top w:val="none" w:color="FFFFFF" w:sz="0"/>
-              <w:left w:val="none" w:color="FFFFFF" w:sz="0"/>
-              <w:bottom w:val="none" w:color="FFFFFF" w:sz="0"/>
-              <w:right w:val="none" w:color="FFFFFF" w:sz="0"/>
+              <w:top w:val="single" w:color="000000" w:sz="8"/>
+              <w:left w:val="single" w:color="000000" w:sz="8"/>
+              <w:bottom w:val="single" w:color="000000" w:sz="8"/>
+              <w:right w:val="single" w:color="000000" w:sz="8"/>
             </w:tcBorders>
             <w:tcMar>
               <w:top w:type="dxa" w:w="40"/>
@@ -8500,10 +8486,10 @@
           <w:tcPr>
             <w:tcW w:type="dxa" w:w="3160"/>
             <w:tcBorders>
-              <w:top w:val="none" w:color="FFFFFF" w:sz="0"/>
-              <w:left w:val="none" w:color="FFFFFF" w:sz="0"/>
-              <w:bottom w:val="none" w:color="FFFFFF" w:sz="0"/>
-              <w:right w:val="none" w:color="FFFFFF" w:sz="0"/>
+              <w:top w:val="single" w:color="000000" w:sz="8"/>
+              <w:left w:val="single" w:color="000000" w:sz="8"/>
+              <w:bottom w:val="single" w:color="000000" w:sz="8"/>
+              <w:right w:val="single" w:color="000000" w:sz="8"/>
             </w:tcBorders>
             <w:tcMar>
               <w:top w:type="dxa" w:w="40"/>
@@ -8538,10 +8524,10 @@
           <w:tcPr>
             <w:tcW w:type="dxa" w:w="4000"/>
             <w:tcBorders>
-              <w:top w:val="none" w:color="FFFFFF" w:sz="0"/>
-              <w:left w:val="none" w:color="FFFFFF" w:sz="0"/>
-              <w:bottom w:val="none" w:color="FFFFFF" w:sz="0"/>
-              <w:right w:val="none" w:color="FFFFFF" w:sz="0"/>
+              <w:top w:val="single" w:color="000000" w:sz="8"/>
+              <w:left w:val="single" w:color="000000" w:sz="8"/>
+              <w:bottom w:val="single" w:color="000000" w:sz="8"/>
+              <w:right w:val="single" w:color="000000" w:sz="8"/>
             </w:tcBorders>
             <w:tcMar>
               <w:top w:type="dxa" w:w="40"/>
@@ -8571,10 +8557,10 @@
           <w:tcPr>
             <w:tcW w:type="dxa" w:w="2200"/>
             <w:tcBorders>
-              <w:top w:val="none" w:color="FFFFFF" w:sz="0"/>
-              <w:left w:val="none" w:color="FFFFFF" w:sz="0"/>
-              <w:bottom w:val="none" w:color="FFFFFF" w:sz="0"/>
-              <w:right w:val="none" w:color="FFFFFF" w:sz="0"/>
+              <w:top w:val="single" w:color="000000" w:sz="8"/>
+              <w:left w:val="single" w:color="000000" w:sz="8"/>
+              <w:bottom w:val="single" w:color="000000" w:sz="8"/>
+              <w:right w:val="single" w:color="000000" w:sz="8"/>
             </w:tcBorders>
             <w:tcMar>
               <w:top w:type="dxa" w:w="40"/>
@@ -8604,10 +8590,10 @@
           <w:tcPr>
             <w:tcW w:type="dxa" w:w="3160"/>
             <w:tcBorders>
-              <w:top w:val="none" w:color="FFFFFF" w:sz="0"/>
-              <w:left w:val="none" w:color="FFFFFF" w:sz="0"/>
-              <w:bottom w:val="none" w:color="FFFFFF" w:sz="0"/>
-              <w:right w:val="none" w:color="FFFFFF" w:sz="0"/>
+              <w:top w:val="single" w:color="000000" w:sz="8"/>
+              <w:left w:val="single" w:color="000000" w:sz="8"/>
+              <w:bottom w:val="single" w:color="000000" w:sz="8"/>
+              <w:right w:val="single" w:color="000000" w:sz="8"/>
             </w:tcBorders>
             <w:tcMar>
               <w:top w:type="dxa" w:w="40"/>
@@ -8642,10 +8628,10 @@
           <w:tcPr>
             <w:tcW w:type="dxa" w:w="4000"/>
             <w:tcBorders>
-              <w:top w:val="none" w:color="FFFFFF" w:sz="0"/>
-              <w:left w:val="none" w:color="FFFFFF" w:sz="0"/>
-              <w:bottom w:val="none" w:color="FFFFFF" w:sz="0"/>
-              <w:right w:val="none" w:color="FFFFFF" w:sz="0"/>
+              <w:top w:val="single" w:color="000000" w:sz="8"/>
+              <w:left w:val="single" w:color="000000" w:sz="8"/>
+              <w:bottom w:val="single" w:color="000000" w:sz="8"/>
+              <w:right w:val="single" w:color="000000" w:sz="8"/>
             </w:tcBorders>
             <w:tcMar>
               <w:top w:type="dxa" w:w="40"/>
@@ -8675,10 +8661,10 @@
           <w:tcPr>
             <w:tcW w:type="dxa" w:w="2200"/>
             <w:tcBorders>
-              <w:top w:val="none" w:color="FFFFFF" w:sz="0"/>
-              <w:left w:val="none" w:color="FFFFFF" w:sz="0"/>
-              <w:bottom w:val="none" w:color="FFFFFF" w:sz="0"/>
-              <w:right w:val="none" w:color="FFFFFF" w:sz="0"/>
+              <w:top w:val="single" w:color="000000" w:sz="8"/>
+              <w:left w:val="single" w:color="000000" w:sz="8"/>
+              <w:bottom w:val="single" w:color="000000" w:sz="8"/>
+              <w:right w:val="single" w:color="000000" w:sz="8"/>
             </w:tcBorders>
             <w:tcMar>
               <w:top w:type="dxa" w:w="40"/>
@@ -8708,10 +8694,10 @@
           <w:tcPr>
             <w:tcW w:type="dxa" w:w="3160"/>
             <w:tcBorders>
-              <w:top w:val="none" w:color="FFFFFF" w:sz="0"/>
-              <w:left w:val="none" w:color="FFFFFF" w:sz="0"/>
-              <w:bottom w:val="none" w:color="FFFFFF" w:sz="0"/>
-              <w:right w:val="none" w:color="FFFFFF" w:sz="0"/>
+              <w:top w:val="single" w:color="000000" w:sz="8"/>
+              <w:left w:val="single" w:color="000000" w:sz="8"/>
+              <w:bottom w:val="single" w:color="000000" w:sz="8"/>
+              <w:right w:val="single" w:color="000000" w:sz="8"/>
             </w:tcBorders>
             <w:tcMar>
               <w:top w:type="dxa" w:w="40"/>
@@ -8746,10 +8732,10 @@
           <w:tcPr>
             <w:tcW w:type="dxa" w:w="4000"/>
             <w:tcBorders>
-              <w:top w:val="none" w:color="FFFFFF" w:sz="0"/>
-              <w:left w:val="none" w:color="FFFFFF" w:sz="0"/>
-              <w:bottom w:val="none" w:color="FFFFFF" w:sz="0"/>
-              <w:right w:val="none" w:color="FFFFFF" w:sz="0"/>
+              <w:top w:val="single" w:color="000000" w:sz="8"/>
+              <w:left w:val="single" w:color="000000" w:sz="8"/>
+              <w:bottom w:val="single" w:color="000000" w:sz="8"/>
+              <w:right w:val="single" w:color="000000" w:sz="8"/>
             </w:tcBorders>
             <w:tcMar>
               <w:top w:type="dxa" w:w="40"/>
@@ -8779,10 +8765,10 @@
           <w:tcPr>
             <w:tcW w:type="dxa" w:w="2200"/>
             <w:tcBorders>
-              <w:top w:val="none" w:color="FFFFFF" w:sz="0"/>
-              <w:left w:val="none" w:color="FFFFFF" w:sz="0"/>
-              <w:bottom w:val="none" w:color="FFFFFF" w:sz="0"/>
-              <w:right w:val="none" w:color="FFFFFF" w:sz="0"/>
+              <w:top w:val="single" w:color="000000" w:sz="8"/>
+              <w:left w:val="single" w:color="000000" w:sz="8"/>
+              <w:bottom w:val="single" w:color="000000" w:sz="8"/>
+              <w:right w:val="single" w:color="000000" w:sz="8"/>
             </w:tcBorders>
             <w:tcMar>
               <w:top w:type="dxa" w:w="40"/>
@@ -8812,10 +8798,10 @@
           <w:tcPr>
             <w:tcW w:type="dxa" w:w="3160"/>
             <w:tcBorders>
-              <w:top w:val="none" w:color="FFFFFF" w:sz="0"/>
-              <w:left w:val="none" w:color="FFFFFF" w:sz="0"/>
-              <w:bottom w:val="none" w:color="FFFFFF" w:sz="0"/>
-              <w:right w:val="none" w:color="FFFFFF" w:sz="0"/>
+              <w:top w:val="single" w:color="000000" w:sz="8"/>
+              <w:left w:val="single" w:color="000000" w:sz="8"/>
+              <w:bottom w:val="single" w:color="000000" w:sz="8"/>
+              <w:right w:val="single" w:color="000000" w:sz="8"/>
             </w:tcBorders>
             <w:tcMar>
               <w:top w:type="dxa" w:w="40"/>
@@ -8850,10 +8836,10 @@
           <w:tcPr>
             <w:tcW w:type="dxa" w:w="4000"/>
             <w:tcBorders>
-              <w:top w:val="none" w:color="FFFFFF" w:sz="0"/>
-              <w:left w:val="none" w:color="FFFFFF" w:sz="0"/>
-              <w:bottom w:val="single" w:color="000000" w:sz="8"/>
-              <w:right w:val="none" w:color="FFFFFF" w:sz="0"/>
+              <w:top w:val="single" w:color="000000" w:sz="8"/>
+              <w:left w:val="single" w:color="000000" w:sz="8"/>
+              <w:bottom w:val="single" w:color="000000" w:sz="8"/>
+              <w:right w:val="single" w:color="000000" w:sz="8"/>
             </w:tcBorders>
             <w:tcMar>
               <w:top w:type="dxa" w:w="40"/>
@@ -8883,10 +8869,10 @@
           <w:tcPr>
             <w:tcW w:type="dxa" w:w="2200"/>
             <w:tcBorders>
-              <w:top w:val="none" w:color="FFFFFF" w:sz="0"/>
-              <w:left w:val="none" w:color="FFFFFF" w:sz="0"/>
-              <w:bottom w:val="single" w:color="000000" w:sz="8"/>
-              <w:right w:val="none" w:color="FFFFFF" w:sz="0"/>
+              <w:top w:val="single" w:color="000000" w:sz="8"/>
+              <w:left w:val="single" w:color="000000" w:sz="8"/>
+              <w:bottom w:val="single" w:color="000000" w:sz="8"/>
+              <w:right w:val="single" w:color="000000" w:sz="8"/>
             </w:tcBorders>
             <w:tcMar>
               <w:top w:type="dxa" w:w="40"/>
@@ -8916,10 +8902,10 @@
           <w:tcPr>
             <w:tcW w:type="dxa" w:w="3160"/>
             <w:tcBorders>
-              <w:top w:val="none" w:color="FFFFFF" w:sz="0"/>
-              <w:left w:val="none" w:color="FFFFFF" w:sz="0"/>
-              <w:bottom w:val="single" w:color="000000" w:sz="8"/>
-              <w:right w:val="none" w:color="FFFFFF" w:sz="0"/>
+              <w:top w:val="single" w:color="000000" w:sz="8"/>
+              <w:left w:val="single" w:color="000000" w:sz="8"/>
+              <w:bottom w:val="single" w:color="000000" w:sz="8"/>
+              <w:right w:val="single" w:color="000000" w:sz="8"/>
             </w:tcBorders>
             <w:tcMar>
               <w:top w:type="dxa" w:w="40"/>
@@ -9875,67 +9861,59 @@
     </w:p>
     <w:p>
       <w:pPr>
-        <w:spacing w:after="0" w:line="360"/>
-        <w:ind w:firstLine="720"/>
-        <w:jc w:val="left"/>
-      </w:pPr>
-      <w:r>
-        <w:rPr>
-          <w:rFonts w:ascii="Times New Roman" w:cs="Times New Roman" w:eastAsia="Times New Roman" w:hAnsi="Times New Roman"/>
-          <w:sz w:val="24"/>
-          <w:szCs w:val="24"/>
-        </w:rPr>
-        <w:t xml:space="preserve">Ejemplos de uso:</w:t>
+        <w:keepNext/>
+        <w:spacing w:after="60" w:before="120" w:line="360"/>
+      </w:pPr>
+      <w:r>
+        <w:rPr>
+          <w:rFonts w:ascii="Times New Roman" w:cs="Times New Roman" w:eastAsia="Times New Roman" w:hAnsi="Times New Roman"/>
+          <w:i/>
+          <w:iCs/>
+          <w:sz w:val="24"/>
+          <w:szCs w:val="24"/>
+        </w:rPr>
+        <w:t xml:space="preserve">Nota. </w:t>
+      </w:r>
+      <w:r>
+        <w:rPr>
+          <w:rFonts w:ascii="Times New Roman" w:cs="Times New Roman" w:eastAsia="Times New Roman" w:hAnsi="Times New Roman"/>
+          <w:sz w:val="24"/>
+          <w:szCs w:val="24"/>
+        </w:rPr>
+        <w:t xml:space="preserve">Ejemplos de uso de los analizadores:</w:t>
       </w:r>
     </w:p>
     <w:p>
       <w:pPr>
         <w:keepNext/>
         <w:keepLines/>
-        <w:pBdr>
-          <w:top w:val="single" w:color="000000" w:sz="6" w:space="4"/>
-          <w:left w:val="single" w:color="000000" w:sz="6" w:space="4"/>
-          <w:bottom w:val="single" w:color="000000" w:sz="6" w:space="4"/>
-          <w:right w:val="single" w:color="000000" w:sz="6" w:space="4"/>
-        </w:pBdr>
-        <w:spacing w:after="0" w:line="252"/>
-        <w:ind w:left="200" w:right="200"/>
+        <w:spacing w:after="0" w:line="300"/>
+        <w:ind w:left="720"/>
       </w:pPr>
       <w:r>
         <w:rPr>
           <w:rFonts w:ascii="Consolas" w:cs="Consolas" w:eastAsia="Consolas" w:hAnsi="Consolas"/>
-          <w:sz w:val="19"/>
-          <w:szCs w:val="19"/>
+          <w:sz w:val="20"/>
+          <w:szCs w:val="20"/>
         </w:rPr>
         <w:t xml:space="preserve">python3 fat32_analyzer.py Arqui22025.img --find pdf jpg docx apk asm</w:t>
       </w:r>
     </w:p>
     <w:p>
       <w:pPr>
-        <w:keepNext/>
+        <w:keepNext w:val="false"/>
         <w:keepLines/>
-        <w:pBdr>
-          <w:top w:val="single" w:color="000000" w:sz="6" w:space="4"/>
-          <w:left w:val="single" w:color="000000" w:sz="6" w:space="4"/>
-          <w:bottom w:val="single" w:color="000000" w:sz="6" w:space="4"/>
-          <w:right w:val="single" w:color="000000" w:sz="6" w:space="4"/>
-        </w:pBdr>
-        <w:spacing w:after="0" w:line="252"/>
-        <w:ind w:left="200" w:right="200"/>
+        <w:spacing w:after="160" w:line="300"/>
+        <w:ind w:left="720"/>
       </w:pPr>
       <w:r>
         <w:rPr>
           <w:rFonts w:ascii="Consolas" w:cs="Consolas" w:eastAsia="Consolas" w:hAnsi="Consolas"/>
-          <w:sz w:val="19"/>
-          <w:szCs w:val="19"/>
+          <w:sz w:val="20"/>
+          <w:szCs w:val="20"/>
         </w:rPr>
         <w:t xml:space="preserve">python3 -I ntfs/ntfs_analyzer.py ntfs/lab_ntfs.img --path /Proyectos/2025/Lab2/informe/datos_largo.bin</w:t>
       </w:r>
-    </w:p>
-    <w:p>
-      <w:pPr>
-        <w:spacing w:after="160" w:line="240"/>
-      </w:pPr>
     </w:p>
     <w:p>
       <w:pPr>

</xml_diff>

<commit_message>
style(lab2): make report notes bold
</commit_message>
<xml_diff>
--- a/lab2/informe/Informe_Laboratorio2_FAT32_NTFS.docx
+++ b/lab2/informe/Informe_Laboratorio2_FAT32_NTFS.docx
@@ -1417,8 +1417,8 @@
       <w:r>
         <w:rPr>
           <w:rFonts w:ascii="Times New Roman" w:cs="Times New Roman" w:eastAsia="Times New Roman" w:hAnsi="Times New Roman"/>
-          <w:i/>
-          <w:iCs/>
+          <w:b/>
+          <w:bCs/>
           <w:sz w:val="24"/>
           <w:szCs w:val="24"/>
         </w:rPr>
@@ -1427,6 +1427,8 @@
       <w:r>
         <w:rPr>
           <w:rFonts w:ascii="Times New Roman" w:cs="Times New Roman" w:eastAsia="Times New Roman" w:hAnsi="Times New Roman"/>
+          <w:b/>
+          <w:bCs/>
           <w:sz w:val="24"/>
           <w:szCs w:val="24"/>
         </w:rPr>
@@ -9867,8 +9869,8 @@
       <w:r>
         <w:rPr>
           <w:rFonts w:ascii="Times New Roman" w:cs="Times New Roman" w:eastAsia="Times New Roman" w:hAnsi="Times New Roman"/>
-          <w:i/>
-          <w:iCs/>
+          <w:b/>
+          <w:bCs/>
           <w:sz w:val="24"/>
           <w:szCs w:val="24"/>
         </w:rPr>
@@ -9877,6 +9879,8 @@
       <w:r>
         <w:rPr>
           <w:rFonts w:ascii="Times New Roman" w:cs="Times New Roman" w:eastAsia="Times New Roman" w:hAnsi="Times New Roman"/>
+          <w:b/>
+          <w:bCs/>
           <w:sz w:val="24"/>
           <w:szCs w:val="24"/>
         </w:rPr>

</xml_diff>